<commit_message>
feat: publish French activity kits and digital resources
</commit_message>
<xml_diff>
--- a/ressources/docx/activite-01-corrige.docx
+++ b/ressources/docx/activite-01-corrige.docx
@@ -25,7 +25,7 @@
           <w:b w:val="0"/>
           <w:i w:val="0"/>
         </w:rPr>
-        <w:t>Corrigé et pistes</w:t>
+        <w:t>Corrigé et évaluation</w:t>
       </w:r>
       <w:r>
         <w:br/>
@@ -54,6 +54,7 @@
       <w:tr>
         <w:trPr>
           <w:cantSplit/>
+          <w:tblHeader w:val="true"/>
         </w:trPr>
         <w:tc>
           <w:tcPr>
@@ -75,16 +76,7 @@
                 <w:b/>
                 <w:i w:val="0"/>
               </w:rPr>
-              <w:t>Type</w:t>
-            </w:r>
-          </w:p>
-          <w:p>
-            <w:r>
-              <w:rPr>
-                <w:b w:val="0"/>
-                <w:i w:val="0"/>
-              </w:rPr>
-              <w:t>Corrigé adulte</w:t>
+              <w:t>Public</w:t>
             </w:r>
           </w:p>
         </w:tc>
@@ -108,16 +100,7 @@
                 <w:b/>
                 <w:i w:val="0"/>
               </w:rPr>
-              <w:t>Public</w:t>
-            </w:r>
-          </w:p>
-          <w:p>
-            <w:r>
-              <w:rPr>
-                <w:b w:val="0"/>
-                <w:i w:val="0"/>
-              </w:rPr>
-              <w:t>Enseignants et médiateurs</w:t>
+              <w:t>Correspondance</w:t>
             </w:r>
           </w:p>
         </w:tc>
@@ -141,16 +124,7 @@
                 <w:b/>
                 <w:i w:val="0"/>
               </w:rPr>
-              <w:t>Usage</w:t>
-            </w:r>
-          </w:p>
-          <w:p>
-            <w:r>
-              <w:rPr>
-                <w:b w:val="0"/>
-                <w:i w:val="0"/>
-              </w:rPr>
-              <w:t>Correction collective</w:t>
+              <w:t>But</w:t>
             </w:r>
           </w:p>
         </w:tc>
@@ -177,13 +151,93 @@
               <w:t>Version</w:t>
             </w:r>
           </w:p>
+        </w:tc>
+      </w:tr>
+      <w:tr>
+        <w:trPr>
+          <w:cantSplit/>
+        </w:trPr>
+        <w:tc>
+          <w:tcPr>
+            <w:tcW w:type="dxa" w:w="2579"/>
+            <w:shd w:fill="F7F4EF"/>
+            <w:tcMar>
+              <w:top w:w="90" w:type="dxa"/>
+              <w:start w:w="120" w:type="dxa"/>
+              <w:bottom w:w="90" w:type="dxa"/>
+              <w:end w:w="120" w:type="dxa"/>
+            </w:tcMar>
+          </w:tcPr>
           <w:p>
             <w:r>
               <w:rPr>
                 <w:b w:val="0"/>
                 <w:i w:val="0"/>
               </w:rPr>
-              <w:t>1.0 pilote</w:t>
+              <w:t>Adultes</w:t>
+            </w:r>
+          </w:p>
+        </w:tc>
+        <w:tc>
+          <w:tcPr>
+            <w:tcW w:type="dxa" w:w="2579"/>
+            <w:shd w:fill="F7F4EF"/>
+            <w:tcMar>
+              <w:top w:w="90" w:type="dxa"/>
+              <w:start w:w="120" w:type="dxa"/>
+              <w:bottom w:w="90" w:type="dxa"/>
+              <w:end w:w="120" w:type="dxa"/>
+            </w:tcMar>
+          </w:tcPr>
+          <w:p>
+            <w:r>
+              <w:rPr>
+                <w:b w:val="0"/>
+                <w:i w:val="0"/>
+              </w:rPr>
+              <w:t>6 tâches de la fiche</w:t>
+            </w:r>
+          </w:p>
+        </w:tc>
+        <w:tc>
+          <w:tcPr>
+            <w:tcW w:type="dxa" w:w="2579"/>
+            <w:shd w:fill="F7F4EF"/>
+            <w:tcMar>
+              <w:top w:w="90" w:type="dxa"/>
+              <w:start w:w="120" w:type="dxa"/>
+              <w:bottom w:w="90" w:type="dxa"/>
+              <w:end w:w="120" w:type="dxa"/>
+            </w:tcMar>
+          </w:tcPr>
+          <w:p>
+            <w:r>
+              <w:rPr>
+                <w:b w:val="0"/>
+                <w:i w:val="0"/>
+              </w:rPr>
+              <w:t>Raisonner, pas réciter</w:t>
+            </w:r>
+          </w:p>
+        </w:tc>
+        <w:tc>
+          <w:tcPr>
+            <w:tcW w:type="dxa" w:w="2581"/>
+            <w:shd w:fill="F7F4EF"/>
+            <w:tcMar>
+              <w:top w:w="90" w:type="dxa"/>
+              <w:start w:w="120" w:type="dxa"/>
+              <w:bottom w:w="90" w:type="dxa"/>
+              <w:end w:w="120" w:type="dxa"/>
+            </w:tcMar>
+          </w:tcPr>
+          <w:p>
+            <w:r>
+              <w:rPr>
+                <w:b w:val="0"/>
+                <w:i w:val="0"/>
+              </w:rPr>
+              <w:t>2.0</w:t>
             </w:r>
           </w:p>
         </w:tc>
@@ -191,6 +245,8 @@
     </w:tbl>
     <w:p>
       <w:pPr>
+        <w:pStyle w:val="Heading2"/>
+        <w:keepNext/>
         <w:keepLines/>
       </w:pPr>
       <w:r>
@@ -198,8 +254,951 @@
           <w:b w:val="0"/>
           <w:i w:val="0"/>
         </w:rPr>
-        <w:t>Version pilote - contenu à tester et à relire avant diffusion définitive.</w:t>
+        <w:t>Corrigé tâche par tâche</w:t>
       </w:r>
+    </w:p>
+    <w:tbl>
+      <w:tblPr>
+        <w:tblStyle w:val="TableGrid"/>
+        <w:tblLook w:firstColumn="1" w:firstRow="1" w:lastColumn="0" w:lastRow="0" w:noHBand="0" w:noVBand="1" w:val="04A0"/>
+        <w:tblW w:w="10318" w:type="dxa"/>
+        <w:tblInd w:w="120" w:type="dxa"/>
+        <w:tblLayout w:type="fixed"/>
+      </w:tblPr>
+      <w:tblGrid>
+        <w:gridCol w:w="2064"/>
+        <w:gridCol w:w="2064"/>
+        <w:gridCol w:w="2064"/>
+        <w:gridCol w:w="2064"/>
+        <w:gridCol w:w="2062"/>
+      </w:tblGrid>
+      <w:tr>
+        <w:trPr>
+          <w:cantSplit/>
+          <w:tblHeader w:val="true"/>
+        </w:trPr>
+        <w:tc>
+          <w:tcPr>
+            <w:tcW w:type="dxa" w:w="2064"/>
+            <w:vAlign w:val="center"/>
+            <w:shd w:fill="F0F1EE"/>
+            <w:tcMar>
+              <w:top w:w="90" w:type="dxa"/>
+              <w:start w:w="120" w:type="dxa"/>
+              <w:bottom w:w="90" w:type="dxa"/>
+              <w:end w:w="120" w:type="dxa"/>
+            </w:tcMar>
+          </w:tcPr>
+          <w:p>
+            <w:pPr>
+              <w:keepLines/>
+              <w:spacing w:after="40" w:line="252" w:lineRule="auto"/>
+            </w:pPr>
+            <w:r>
+              <w:rPr>
+                <w:b/>
+                <w:i w:val="0"/>
+              </w:rPr>
+              <w:t>Tâche</w:t>
+            </w:r>
+          </w:p>
+        </w:tc>
+        <w:tc>
+          <w:tcPr>
+            <w:tcW w:type="dxa" w:w="2064"/>
+            <w:vAlign w:val="center"/>
+            <w:shd w:fill="F0F1EE"/>
+            <w:tcMar>
+              <w:top w:w="90" w:type="dxa"/>
+              <w:start w:w="120" w:type="dxa"/>
+              <w:bottom w:w="90" w:type="dxa"/>
+              <w:end w:w="120" w:type="dxa"/>
+            </w:tcMar>
+          </w:tcPr>
+          <w:p>
+            <w:pPr>
+              <w:keepLines/>
+              <w:spacing w:after="40" w:line="252" w:lineRule="auto"/>
+            </w:pPr>
+            <w:r>
+              <w:rPr>
+                <w:b/>
+                <w:i w:val="0"/>
+              </w:rPr>
+              <w:t>Éléments attendus et réponses acceptables</w:t>
+            </w:r>
+          </w:p>
+        </w:tc>
+        <w:tc>
+          <w:tcPr>
+            <w:tcW w:type="dxa" w:w="2064"/>
+            <w:vAlign w:val="center"/>
+            <w:shd w:fill="F0F1EE"/>
+            <w:tcMar>
+              <w:top w:w="90" w:type="dxa"/>
+              <w:start w:w="120" w:type="dxa"/>
+              <w:bottom w:w="90" w:type="dxa"/>
+              <w:end w:w="120" w:type="dxa"/>
+            </w:tcMar>
+          </w:tcPr>
+          <w:p>
+            <w:pPr>
+              <w:keepLines/>
+              <w:spacing w:after="40" w:line="252" w:lineRule="auto"/>
+            </w:pPr>
+            <w:r>
+              <w:rPr>
+                <w:b/>
+                <w:i w:val="0"/>
+              </w:rPr>
+              <w:t>Critère de réussite</w:t>
+            </w:r>
+          </w:p>
+        </w:tc>
+        <w:tc>
+          <w:tcPr>
+            <w:tcW w:type="dxa" w:w="2064"/>
+            <w:vAlign w:val="center"/>
+            <w:shd w:fill="F0F1EE"/>
+            <w:tcMar>
+              <w:top w:w="90" w:type="dxa"/>
+              <w:start w:w="120" w:type="dxa"/>
+              <w:bottom w:w="90" w:type="dxa"/>
+              <w:end w:w="120" w:type="dxa"/>
+            </w:tcMar>
+          </w:tcPr>
+          <w:p>
+            <w:pPr>
+              <w:keepLines/>
+              <w:spacing w:after="40" w:line="252" w:lineRule="auto"/>
+            </w:pPr>
+            <w:r>
+              <w:rPr>
+                <w:b/>
+                <w:i w:val="0"/>
+              </w:rPr>
+              <w:t>Erreur et relance</w:t>
+            </w:r>
+          </w:p>
+        </w:tc>
+        <w:tc>
+          <w:tcPr>
+            <w:tcW w:type="dxa" w:w="2062"/>
+            <w:vAlign w:val="center"/>
+            <w:shd w:fill="F0F1EE"/>
+            <w:tcMar>
+              <w:top w:w="90" w:type="dxa"/>
+              <w:start w:w="120" w:type="dxa"/>
+              <w:bottom w:w="90" w:type="dxa"/>
+              <w:end w:w="120" w:type="dxa"/>
+            </w:tcMar>
+          </w:tcPr>
+          <w:p>
+            <w:pPr>
+              <w:keepLines/>
+              <w:spacing w:after="40" w:line="252" w:lineRule="auto"/>
+            </w:pPr>
+            <w:r>
+              <w:rPr>
+                <w:b/>
+                <w:i w:val="0"/>
+              </w:rPr>
+              <w:t>Certitude</w:t>
+            </w:r>
+          </w:p>
+        </w:tc>
+      </w:tr>
+      <w:tr>
+        <w:trPr>
+          <w:cantSplit/>
+        </w:trPr>
+        <w:tc>
+          <w:tcPr>
+            <w:tcW w:type="dxa" w:w="2064"/>
+            <w:vAlign w:val="center"/>
+            <w:shd w:fill="F0F1EE"/>
+            <w:tcMar>
+              <w:top w:w="90" w:type="dxa"/>
+              <w:start w:w="120" w:type="dxa"/>
+              <w:bottom w:w="90" w:type="dxa"/>
+              <w:end w:w="120" w:type="dxa"/>
+            </w:tcMar>
+          </w:tcPr>
+          <w:p>
+            <w:pPr>
+              <w:keepLines/>
+              <w:spacing w:after="40" w:line="252" w:lineRule="auto"/>
+            </w:pPr>
+            <w:r>
+              <w:rPr>
+                <w:b/>
+                <w:i w:val="0"/>
+              </w:rPr>
+              <w:t>1. Observer</w:t>
+            </w:r>
+          </w:p>
+        </w:tc>
+        <w:tc>
+          <w:tcPr>
+            <w:tcW w:type="dxa" w:w="2064"/>
+            <w:vAlign w:val="center"/>
+            <w:tcMar>
+              <w:top w:w="90" w:type="dxa"/>
+              <w:start w:w="120" w:type="dxa"/>
+              <w:bottom w:w="90" w:type="dxa"/>
+              <w:end w:w="120" w:type="dxa"/>
+            </w:tcMar>
+          </w:tcPr>
+          <w:p>
+            <w:pPr>
+              <w:keepLines/>
+              <w:spacing w:after="40" w:line="252" w:lineRule="auto"/>
+            </w:pPr>
+            <w:r>
+              <w:rPr>
+                <w:b w:val="0"/>
+                <w:i w:val="0"/>
+              </w:rPr>
+              <w:t>Trois détails montrables : contours irréguliers, reliefs, creux, parties arrondies ou surfaces paraissant lisses. Un dessin annoté est acceptable.</w:t>
+            </w:r>
+          </w:p>
+        </w:tc>
+        <w:tc>
+          <w:tcPr>
+            <w:tcW w:type="dxa" w:w="2064"/>
+            <w:vAlign w:val="center"/>
+            <w:tcMar>
+              <w:top w:w="90" w:type="dxa"/>
+              <w:start w:w="120" w:type="dxa"/>
+              <w:bottom w:w="90" w:type="dxa"/>
+              <w:end w:w="120" w:type="dxa"/>
+            </w:tcMar>
+          </w:tcPr>
+          <w:p>
+            <w:pPr>
+              <w:keepLines/>
+              <w:spacing w:after="40" w:line="252" w:lineRule="auto"/>
+            </w:pPr>
+            <w:r>
+              <w:rPr>
+                <w:b w:val="0"/>
+                <w:i w:val="0"/>
+              </w:rPr>
+              <w:t>Au moins trois observations sans nom d'emplacement.</w:t>
+            </w:r>
+          </w:p>
+        </w:tc>
+        <w:tc>
+          <w:tcPr>
+            <w:tcW w:type="dxa" w:w="2064"/>
+            <w:vAlign w:val="center"/>
+            <w:tcMar>
+              <w:top w:w="90" w:type="dxa"/>
+              <w:start w:w="120" w:type="dxa"/>
+              <w:bottom w:w="90" w:type="dxa"/>
+              <w:end w:w="120" w:type="dxa"/>
+            </w:tcMar>
+          </w:tcPr>
+          <w:p>
+            <w:pPr>
+              <w:keepLines/>
+              <w:spacing w:after="40" w:line="252" w:lineRule="auto"/>
+            </w:pPr>
+            <w:r>
+              <w:rPr>
+                <w:b w:val="0"/>
+                <w:i w:val="0"/>
+              </w:rPr>
+              <w:t>Erreur : « c'est un os du pied ». Relance : « Que peux-tu montrer du doigt ? »</w:t>
+            </w:r>
+          </w:p>
+        </w:tc>
+        <w:tc>
+          <w:tcPr>
+            <w:tcW w:type="dxa" w:w="2062"/>
+            <w:vAlign w:val="center"/>
+            <w:tcMar>
+              <w:top w:w="90" w:type="dxa"/>
+              <w:start w:w="120" w:type="dxa"/>
+              <w:bottom w:w="90" w:type="dxa"/>
+              <w:end w:w="120" w:type="dxa"/>
+            </w:tcMar>
+          </w:tcPr>
+          <w:p>
+            <w:pPr>
+              <w:keepLines/>
+              <w:spacing w:after="40" w:line="252" w:lineRule="auto"/>
+            </w:pPr>
+            <w:r>
+              <w:rPr>
+                <w:b w:val="0"/>
+                <w:i w:val="0"/>
+              </w:rPr>
+              <w:t>Observation directe du support.</w:t>
+            </w:r>
+          </w:p>
+        </w:tc>
+      </w:tr>
+      <w:tr>
+        <w:trPr>
+          <w:cantSplit/>
+        </w:trPr>
+        <w:tc>
+          <w:tcPr>
+            <w:tcW w:type="dxa" w:w="2064"/>
+            <w:vAlign w:val="center"/>
+            <w:shd w:fill="F0F1EE"/>
+            <w:tcMar>
+              <w:top w:w="90" w:type="dxa"/>
+              <w:start w:w="120" w:type="dxa"/>
+              <w:bottom w:w="90" w:type="dxa"/>
+              <w:end w:w="120" w:type="dxa"/>
+            </w:tcMar>
+          </w:tcPr>
+          <w:p>
+            <w:pPr>
+              <w:keepLines/>
+              <w:spacing w:after="40" w:line="252" w:lineRule="auto"/>
+            </w:pPr>
+            <w:r>
+              <w:rPr>
+                <w:b/>
+                <w:i w:val="0"/>
+              </w:rPr>
+              <w:t>2. Séparer</w:t>
+            </w:r>
+          </w:p>
+        </w:tc>
+        <w:tc>
+          <w:tcPr>
+            <w:tcW w:type="dxa" w:w="2064"/>
+            <w:vAlign w:val="center"/>
+            <w:tcMar>
+              <w:top w:w="90" w:type="dxa"/>
+              <w:start w:w="120" w:type="dxa"/>
+              <w:bottom w:w="90" w:type="dxa"/>
+              <w:end w:w="120" w:type="dxa"/>
+            </w:tcMar>
+          </w:tcPr>
+          <w:p>
+            <w:pPr>
+              <w:keepLines/>
+              <w:spacing w:after="40" w:line="252" w:lineRule="auto"/>
+            </w:pPr>
+            <w:r>
+              <w:rPr>
+                <w:b w:val="0"/>
+                <w:i w:val="0"/>
+              </w:rPr>
+              <w:t>Colonne observation : détail visible. Colonne hypothèse : place possible. Les hypothèses variées sont acceptables au départ.</w:t>
+            </w:r>
+          </w:p>
+        </w:tc>
+        <w:tc>
+          <w:tcPr>
+            <w:tcW w:type="dxa" w:w="2064"/>
+            <w:vAlign w:val="center"/>
+            <w:tcMar>
+              <w:top w:w="90" w:type="dxa"/>
+              <w:start w:w="120" w:type="dxa"/>
+              <w:bottom w:w="90" w:type="dxa"/>
+              <w:end w:w="120" w:type="dxa"/>
+            </w:tcMar>
+          </w:tcPr>
+          <w:p>
+            <w:pPr>
+              <w:keepLines/>
+              <w:spacing w:after="40" w:line="252" w:lineRule="auto"/>
+            </w:pPr>
+            <w:r>
+              <w:rPr>
+                <w:b w:val="0"/>
+                <w:i w:val="0"/>
+              </w:rPr>
+              <w:t>Les deux phrases n'ont pas le même statut.</w:t>
+            </w:r>
+          </w:p>
+        </w:tc>
+        <w:tc>
+          <w:tcPr>
+            <w:tcW w:type="dxa" w:w="2064"/>
+            <w:vAlign w:val="center"/>
+            <w:tcMar>
+              <w:top w:w="90" w:type="dxa"/>
+              <w:start w:w="120" w:type="dxa"/>
+              <w:bottom w:w="90" w:type="dxa"/>
+              <w:end w:w="120" w:type="dxa"/>
+            </w:tcMar>
+          </w:tcPr>
+          <w:p>
+            <w:pPr>
+              <w:keepLines/>
+              <w:spacing w:after="40" w:line="252" w:lineRule="auto"/>
+            </w:pPr>
+            <w:r>
+              <w:rPr>
+                <w:b w:val="0"/>
+                <w:i w:val="0"/>
+              </w:rPr>
+              <w:t>Erreur : présenter une supposition comme un fait. Relance : « L'image le montre-t-elle vraiment ? »</w:t>
+            </w:r>
+          </w:p>
+        </w:tc>
+        <w:tc>
+          <w:tcPr>
+            <w:tcW w:type="dxa" w:w="2062"/>
+            <w:vAlign w:val="center"/>
+            <w:tcMar>
+              <w:top w:w="90" w:type="dxa"/>
+              <w:start w:w="120" w:type="dxa"/>
+              <w:bottom w:w="90" w:type="dxa"/>
+              <w:end w:w="120" w:type="dxa"/>
+            </w:tcMar>
+          </w:tcPr>
+          <w:p>
+            <w:pPr>
+              <w:keepLines/>
+              <w:spacing w:after="40" w:line="252" w:lineRule="auto"/>
+            </w:pPr>
+            <w:r>
+              <w:rPr>
+                <w:b w:val="0"/>
+                <w:i w:val="0"/>
+              </w:rPr>
+              <w:t>L'hypothèse reste provisoire.</w:t>
+            </w:r>
+          </w:p>
+        </w:tc>
+      </w:tr>
+      <w:tr>
+        <w:trPr>
+          <w:cantSplit/>
+        </w:trPr>
+        <w:tc>
+          <w:tcPr>
+            <w:tcW w:type="dxa" w:w="2064"/>
+            <w:vAlign w:val="center"/>
+            <w:shd w:fill="F0F1EE"/>
+            <w:tcMar>
+              <w:top w:w="90" w:type="dxa"/>
+              <w:start w:w="120" w:type="dxa"/>
+              <w:bottom w:w="90" w:type="dxa"/>
+              <w:end w:w="120" w:type="dxa"/>
+            </w:tcMar>
+          </w:tcPr>
+          <w:p>
+            <w:pPr>
+              <w:keepLines/>
+              <w:spacing w:after="40" w:line="252" w:lineRule="auto"/>
+            </w:pPr>
+            <w:r>
+              <w:rPr>
+                <w:b/>
+                <w:i w:val="0"/>
+              </w:rPr>
+              <w:t>3. Localiser</w:t>
+            </w:r>
+          </w:p>
+        </w:tc>
+        <w:tc>
+          <w:tcPr>
+            <w:tcW w:type="dxa" w:w="2064"/>
+            <w:vAlign w:val="center"/>
+            <w:tcMar>
+              <w:top w:w="90" w:type="dxa"/>
+              <w:start w:w="120" w:type="dxa"/>
+              <w:bottom w:w="90" w:type="dxa"/>
+              <w:end w:w="120" w:type="dxa"/>
+            </w:tcMar>
+          </w:tcPr>
+          <w:p>
+            <w:pPr>
+              <w:keepLines/>
+              <w:spacing w:after="40" w:line="252" w:lineRule="auto"/>
+            </w:pPr>
+            <w:r>
+              <w:rPr>
+                <w:b w:val="0"/>
+                <w:i w:val="0"/>
+              </w:rPr>
+              <w:t>Petite zone du tarse, sous la jambe et au-dessus de l'arrière du pied. « Près de la cheville, dans le pied » est acceptable si la zone est précise.</w:t>
+            </w:r>
+          </w:p>
+        </w:tc>
+        <w:tc>
+          <w:tcPr>
+            <w:tcW w:type="dxa" w:w="2064"/>
+            <w:vAlign w:val="center"/>
+            <w:tcMar>
+              <w:top w:w="90" w:type="dxa"/>
+              <w:start w:w="120" w:type="dxa"/>
+              <w:bottom w:w="90" w:type="dxa"/>
+              <w:end w:w="120" w:type="dxa"/>
+            </w:tcMar>
+          </w:tcPr>
+          <w:p>
+            <w:pPr>
+              <w:keepLines/>
+              <w:spacing w:after="40" w:line="252" w:lineRule="auto"/>
+            </w:pPr>
+            <w:r>
+              <w:rPr>
+                <w:b w:val="0"/>
+                <w:i w:val="0"/>
+              </w:rPr>
+              <w:t>Zone limitée et révisable.</w:t>
+            </w:r>
+          </w:p>
+        </w:tc>
+        <w:tc>
+          <w:tcPr>
+            <w:tcW w:type="dxa" w:w="2064"/>
+            <w:vAlign w:val="center"/>
+            <w:tcMar>
+              <w:top w:w="90" w:type="dxa"/>
+              <w:start w:w="120" w:type="dxa"/>
+              <w:bottom w:w="90" w:type="dxa"/>
+              <w:end w:w="120" w:type="dxa"/>
+            </w:tcMar>
+          </w:tcPr>
+          <w:p>
+            <w:pPr>
+              <w:keepLines/>
+              <w:spacing w:after="40" w:line="252" w:lineRule="auto"/>
+            </w:pPr>
+            <w:r>
+              <w:rPr>
+                <w:b w:val="0"/>
+                <w:i w:val="0"/>
+              </w:rPr>
+              <w:t>Erreur : tout le talon ou tout le pied. Relance : « Quel os touche la jambe ? »</w:t>
+            </w:r>
+          </w:p>
+        </w:tc>
+        <w:tc>
+          <w:tcPr>
+            <w:tcW w:type="dxa" w:w="2062"/>
+            <w:vAlign w:val="center"/>
+            <w:tcMar>
+              <w:top w:w="90" w:type="dxa"/>
+              <w:start w:w="120" w:type="dxa"/>
+              <w:bottom w:w="90" w:type="dxa"/>
+              <w:end w:w="120" w:type="dxa"/>
+            </w:tcMar>
+          </w:tcPr>
+          <w:p>
+            <w:pPr>
+              <w:keepLines/>
+              <w:spacing w:after="40" w:line="252" w:lineRule="auto"/>
+            </w:pPr>
+            <w:r>
+              <w:rPr>
+                <w:b w:val="0"/>
+                <w:i w:val="0"/>
+              </w:rPr>
+              <w:t>Localisation confirmée par les supports 3 et 4.</w:t>
+            </w:r>
+          </w:p>
+        </w:tc>
+      </w:tr>
+      <w:tr>
+        <w:trPr>
+          <w:cantSplit/>
+        </w:trPr>
+        <w:tc>
+          <w:tcPr>
+            <w:tcW w:type="dxa" w:w="2064"/>
+            <w:vAlign w:val="center"/>
+            <w:shd w:fill="F0F1EE"/>
+            <w:tcMar>
+              <w:top w:w="90" w:type="dxa"/>
+              <w:start w:w="120" w:type="dxa"/>
+              <w:bottom w:w="90" w:type="dxa"/>
+              <w:end w:w="120" w:type="dxa"/>
+            </w:tcMar>
+          </w:tcPr>
+          <w:p>
+            <w:pPr>
+              <w:keepLines/>
+              <w:spacing w:after="40" w:line="252" w:lineRule="auto"/>
+            </w:pPr>
+            <w:r>
+              <w:rPr>
+                <w:b/>
+                <w:i w:val="0"/>
+              </w:rPr>
+              <w:t>4. Deux indices initiaux</w:t>
+            </w:r>
+          </w:p>
+        </w:tc>
+        <w:tc>
+          <w:tcPr>
+            <w:tcW w:type="dxa" w:w="2064"/>
+            <w:vAlign w:val="center"/>
+            <w:tcMar>
+              <w:top w:w="90" w:type="dxa"/>
+              <w:start w:w="120" w:type="dxa"/>
+              <w:bottom w:w="90" w:type="dxa"/>
+              <w:end w:w="120" w:type="dxa"/>
+            </w:tcMar>
+          </w:tcPr>
+          <w:p>
+            <w:pPr>
+              <w:keepLines/>
+              <w:spacing w:after="40" w:line="252" w:lineRule="auto"/>
+            </w:pPr>
+            <w:r>
+              <w:rPr>
+                <w:b w:val="0"/>
+                <w:i w:val="0"/>
+              </w:rPr>
+              <w:t>Indices disponibles avant révélation : détail de forme sur les vues A-B; position proposée sous la jambe ou entre plusieurs os sur le pied neutre; cohérence entre la forme observée et la petite zone choisie. Les termes calcanéum et talus ne sont pas attendus à ce stade.</w:t>
+            </w:r>
+          </w:p>
+        </w:tc>
+        <w:tc>
+          <w:tcPr>
+            <w:tcW w:type="dxa" w:w="2064"/>
+            <w:vAlign w:val="center"/>
+            <w:tcMar>
+              <w:top w:w="90" w:type="dxa"/>
+              <w:start w:w="120" w:type="dxa"/>
+              <w:bottom w:w="90" w:type="dxa"/>
+              <w:end w:w="120" w:type="dxa"/>
+            </w:tcMar>
+          </w:tcPr>
+          <w:p>
+            <w:pPr>
+              <w:keepLines/>
+              <w:spacing w:after="40" w:line="252" w:lineRule="auto"/>
+            </w:pPr>
+            <w:r>
+              <w:rPr>
+                <w:b w:val="0"/>
+                <w:i w:val="0"/>
+              </w:rPr>
+              <w:t>Deux arguments distincts reliés à la proposition avec les informations déjà visibles.</w:t>
+            </w:r>
+          </w:p>
+        </w:tc>
+        <w:tc>
+          <w:tcPr>
+            <w:tcW w:type="dxa" w:w="2064"/>
+            <w:vAlign w:val="center"/>
+            <w:tcMar>
+              <w:top w:w="90" w:type="dxa"/>
+              <w:start w:w="120" w:type="dxa"/>
+              <w:bottom w:w="90" w:type="dxa"/>
+              <w:end w:w="120" w:type="dxa"/>
+            </w:tcMar>
+          </w:tcPr>
+          <w:p>
+            <w:pPr>
+              <w:keepLines/>
+              <w:spacing w:after="40" w:line="252" w:lineRule="auto"/>
+            </w:pPr>
+            <w:r>
+              <w:rPr>
+                <w:b w:val="0"/>
+                <w:i w:val="0"/>
+              </w:rPr>
+              <w:t>Erreur : citer une légende non encore montrée ou répéter le même indice. Relance : « Quel détail vois-tu maintenant ? »</w:t>
+            </w:r>
+          </w:p>
+        </w:tc>
+        <w:tc>
+          <w:tcPr>
+            <w:tcW w:type="dxa" w:w="2062"/>
+            <w:vAlign w:val="center"/>
+            <w:tcMar>
+              <w:top w:w="90" w:type="dxa"/>
+              <w:start w:w="120" w:type="dxa"/>
+              <w:bottom w:w="90" w:type="dxa"/>
+              <w:end w:w="120" w:type="dxa"/>
+            </w:tcMar>
+          </w:tcPr>
+          <w:p>
+            <w:pPr>
+              <w:keepLines/>
+              <w:spacing w:after="40" w:line="252" w:lineRule="auto"/>
+            </w:pPr>
+            <w:r>
+              <w:rPr>
+                <w:b w:val="0"/>
+                <w:i w:val="0"/>
+              </w:rPr>
+              <w:t>Indices d'hypothèse, pas identification experte.</w:t>
+            </w:r>
+          </w:p>
+        </w:tc>
+      </w:tr>
+      <w:tr>
+        <w:trPr>
+          <w:cantSplit/>
+        </w:trPr>
+        <w:tc>
+          <w:tcPr>
+            <w:tcW w:type="dxa" w:w="2064"/>
+            <w:vAlign w:val="center"/>
+            <w:shd w:fill="F0F1EE"/>
+            <w:tcMar>
+              <w:top w:w="90" w:type="dxa"/>
+              <w:start w:w="120" w:type="dxa"/>
+              <w:bottom w:w="90" w:type="dxa"/>
+              <w:end w:w="120" w:type="dxa"/>
+            </w:tcMar>
+          </w:tcPr>
+          <w:p>
+            <w:pPr>
+              <w:keepLines/>
+              <w:spacing w:after="40" w:line="252" w:lineRule="auto"/>
+            </w:pPr>
+            <w:r>
+              <w:rPr>
+                <w:b/>
+                <w:i w:val="0"/>
+              </w:rPr>
+              <w:t>5. Vérifier et transférer</w:t>
+            </w:r>
+          </w:p>
+        </w:tc>
+        <w:tc>
+          <w:tcPr>
+            <w:tcW w:type="dxa" w:w="2064"/>
+            <w:vAlign w:val="center"/>
+            <w:tcMar>
+              <w:top w:w="90" w:type="dxa"/>
+              <w:start w:w="120" w:type="dxa"/>
+              <w:bottom w:w="90" w:type="dxa"/>
+              <w:end w:w="120" w:type="dxa"/>
+            </w:tcMar>
+          </w:tcPr>
+          <w:p>
+            <w:pPr>
+              <w:keepLines/>
+              <w:spacing w:after="40" w:line="252" w:lineRule="auto"/>
+            </w:pPr>
+            <w:r>
+              <w:rPr>
+                <w:b w:val="0"/>
+                <w:i w:val="0"/>
+              </w:rPr>
+              <w:t>Talus/astragale : os du tarse sous la jambe. Calcanéum : os sous le talus vers l'arrière. Talon : région du corps à l'arrière du pied. Sur la seconde orientation, l'élève retrouve l'os par sa position et dit ce qu'il maintient ou corrige.</w:t>
+            </w:r>
+          </w:p>
+        </w:tc>
+        <w:tc>
+          <w:tcPr>
+            <w:tcW w:type="dxa" w:w="2064"/>
+            <w:vAlign w:val="center"/>
+            <w:tcMar>
+              <w:top w:w="90" w:type="dxa"/>
+              <w:start w:w="120" w:type="dxa"/>
+              <w:bottom w:w="90" w:type="dxa"/>
+              <w:end w:w="120" w:type="dxa"/>
+            </w:tcMar>
+          </w:tcPr>
+          <w:p>
+            <w:pPr>
+              <w:keepLines/>
+              <w:spacing w:after="40" w:line="252" w:lineRule="auto"/>
+            </w:pPr>
+            <w:r>
+              <w:rPr>
+                <w:b w:val="0"/>
+                <w:i w:val="0"/>
+              </w:rPr>
+              <w:t>Les trois notions ne sont pas synonymes et la révision est explicitée.</w:t>
+            </w:r>
+          </w:p>
+        </w:tc>
+        <w:tc>
+          <w:tcPr>
+            <w:tcW w:type="dxa" w:w="2064"/>
+            <w:vAlign w:val="center"/>
+            <w:tcMar>
+              <w:top w:w="90" w:type="dxa"/>
+              <w:start w:w="120" w:type="dxa"/>
+              <w:bottom w:w="90" w:type="dxa"/>
+              <w:end w:w="120" w:type="dxa"/>
+            </w:tcMar>
+          </w:tcPr>
+          <w:p>
+            <w:pPr>
+              <w:keepLines/>
+              <w:spacing w:after="40" w:line="252" w:lineRule="auto"/>
+            </w:pPr>
+            <w:r>
+              <w:rPr>
+                <w:b w:val="0"/>
+                <w:i w:val="0"/>
+              </w:rPr>
+              <w:t>Erreur : talus = talon ou mémorisation de la couleur seule. Relance : « Qu'est-ce qui reste au-dessus et au-dessous ? »</w:t>
+            </w:r>
+          </w:p>
+        </w:tc>
+        <w:tc>
+          <w:tcPr>
+            <w:tcW w:type="dxa" w:w="2062"/>
+            <w:vAlign w:val="center"/>
+            <w:tcMar>
+              <w:top w:w="90" w:type="dxa"/>
+              <w:start w:w="120" w:type="dxa"/>
+              <w:bottom w:w="90" w:type="dxa"/>
+              <w:end w:w="120" w:type="dxa"/>
+            </w:tcMar>
+          </w:tcPr>
+          <w:p>
+            <w:pPr>
+              <w:keepLines/>
+              <w:spacing w:after="40" w:line="252" w:lineRule="auto"/>
+            </w:pPr>
+            <w:r>
+              <w:rPr>
+                <w:b w:val="0"/>
+                <w:i w:val="0"/>
+              </w:rPr>
+              <w:t>Terminologie appuyée par les sources; schéma à valider humainement.</w:t>
+            </w:r>
+          </w:p>
+        </w:tc>
+      </w:tr>
+      <w:tr>
+        <w:trPr>
+          <w:cantSplit/>
+        </w:trPr>
+        <w:tc>
+          <w:tcPr>
+            <w:tcW w:type="dxa" w:w="2064"/>
+            <w:vAlign w:val="center"/>
+            <w:shd w:fill="F0F1EE"/>
+            <w:tcMar>
+              <w:top w:w="90" w:type="dxa"/>
+              <w:start w:w="120" w:type="dxa"/>
+              <w:bottom w:w="90" w:type="dxa"/>
+              <w:end w:w="120" w:type="dxa"/>
+            </w:tcMar>
+          </w:tcPr>
+          <w:p>
+            <w:pPr>
+              <w:keepLines/>
+              <w:spacing w:after="40" w:line="252" w:lineRule="auto"/>
+            </w:pPr>
+            <w:r>
+              <w:rPr>
+                <w:b/>
+                <w:i w:val="0"/>
+              </w:rPr>
+              <w:t>6. Comparer et conclure</w:t>
+            </w:r>
+          </w:p>
+        </w:tc>
+        <w:tc>
+          <w:tcPr>
+            <w:tcW w:type="dxa" w:w="2064"/>
+            <w:vAlign w:val="center"/>
+            <w:tcMar>
+              <w:top w:w="90" w:type="dxa"/>
+              <w:start w:w="120" w:type="dxa"/>
+              <w:bottom w:w="90" w:type="dxa"/>
+              <w:end w:w="120" w:type="dxa"/>
+            </w:tcMar>
+          </w:tcPr>
+          <w:p>
+            <w:pPr>
+              <w:keepLines/>
+              <w:spacing w:after="40" w:line="252" w:lineRule="auto"/>
+            </w:pPr>
+            <w:r>
+              <w:rPr>
+                <w:b w:val="0"/>
+                <w:i w:val="0"/>
+              </w:rPr>
+              <w:t>Prolongement facultatif. Ressemblance : région de jonction entre membre et pied. Différence : un écart visible sur les supports, sans en déduire seul une différence anatomique ou locomotrice. Limite : la photo entière ne permet pas d'identifier sûrement le talus. Conclusion avec « probablement » ou « à vérifier ».</w:t>
+            </w:r>
+          </w:p>
+        </w:tc>
+        <w:tc>
+          <w:tcPr>
+            <w:tcW w:type="dxa" w:w="2064"/>
+            <w:vAlign w:val="center"/>
+            <w:tcMar>
+              <w:top w:w="90" w:type="dxa"/>
+              <w:start w:w="120" w:type="dxa"/>
+              <w:bottom w:w="90" w:type="dxa"/>
+              <w:end w:w="120" w:type="dxa"/>
+            </w:tcMar>
+          </w:tcPr>
+          <w:p>
+            <w:pPr>
+              <w:keepLines/>
+              <w:spacing w:after="40" w:line="252" w:lineRule="auto"/>
+            </w:pPr>
+            <w:r>
+              <w:rPr>
+                <w:b w:val="0"/>
+                <w:i w:val="0"/>
+              </w:rPr>
+              <w:t>Une ressemblance, une différence visible, une limite et une conclusion prudente.</w:t>
+            </w:r>
+          </w:p>
+        </w:tc>
+        <w:tc>
+          <w:tcPr>
+            <w:tcW w:type="dxa" w:w="2064"/>
+            <w:vAlign w:val="center"/>
+            <w:tcMar>
+              <w:top w:w="90" w:type="dxa"/>
+              <w:start w:w="120" w:type="dxa"/>
+              <w:bottom w:w="90" w:type="dxa"/>
+              <w:end w:w="120" w:type="dxa"/>
+            </w:tcMar>
+          </w:tcPr>
+          <w:p>
+            <w:pPr>
+              <w:keepLines/>
+              <w:spacing w:after="40" w:line="252" w:lineRule="auto"/>
+            </w:pPr>
+            <w:r>
+              <w:rPr>
+                <w:b w:val="0"/>
+                <w:i w:val="0"/>
+              </w:rPr>
+              <w:t>Erreur : « même forme donc même os » ou interpréter la posture d'un squelette monté. Relance : « Quelle donnée manque ? »</w:t>
+            </w:r>
+          </w:p>
+        </w:tc>
+        <w:tc>
+          <w:tcPr>
+            <w:tcW w:type="dxa" w:w="2062"/>
+            <w:vAlign w:val="center"/>
+            <w:tcMar>
+              <w:top w:w="90" w:type="dxa"/>
+              <w:start w:w="120" w:type="dxa"/>
+              <w:bottom w:w="90" w:type="dxa"/>
+              <w:end w:w="120" w:type="dxa"/>
+            </w:tcMar>
+          </w:tcPr>
+          <w:p>
+            <w:pPr>
+              <w:keepLines/>
+              <w:spacing w:after="40" w:line="252" w:lineRule="auto"/>
+            </w:pPr>
+            <w:r>
+              <w:rPr>
+                <w:b w:val="0"/>
+                <w:i w:val="0"/>
+              </w:rPr>
+              <w:t>Transfert régional seulement; validation comparative requise.</w:t>
+            </w:r>
+          </w:p>
+        </w:tc>
+      </w:tr>
+    </w:tbl>
+    <w:p>
+      <w:pPr>
+        <w:spacing w:after="0"/>
+      </w:pPr>
     </w:p>
     <w:p>
       <w:pPr>
@@ -212,7 +1211,7 @@
           <w:b w:val="0"/>
           <w:i w:val="0"/>
         </w:rPr>
-        <w:t>Repères rapides</w:t>
+        <w:t>Grille courte d'évaluation</w:t>
       </w:r>
     </w:p>
     <w:tbl>
@@ -248,7 +1247,6 @@
           </w:tcPr>
           <w:p>
             <w:pPr>
-              <w:keepNext/>
               <w:keepLines/>
               <w:spacing w:after="40" w:line="252" w:lineRule="auto"/>
             </w:pPr>
@@ -257,7 +1255,7 @@
                 <w:b/>
                 <w:i w:val="0"/>
               </w:rPr>
-              <w:t>Étape de la fiche</w:t>
+              <w:t>Critère observable</w:t>
             </w:r>
           </w:p>
         </w:tc>
@@ -275,7 +1273,6 @@
           </w:tcPr>
           <w:p>
             <w:pPr>
-              <w:keepNext/>
               <w:keepLines/>
               <w:spacing w:after="40" w:line="252" w:lineRule="auto"/>
             </w:pPr>
@@ -284,7 +1281,7 @@
                 <w:b/>
                 <w:i w:val="0"/>
               </w:rPr>
-              <w:t>Réponse attendue</w:t>
+              <w:t>Acquis</w:t>
             </w:r>
           </w:p>
         </w:tc>
@@ -302,7 +1299,6 @@
           </w:tcPr>
           <w:p>
             <w:pPr>
-              <w:keepNext/>
               <w:keepLines/>
               <w:spacing w:after="40" w:line="252" w:lineRule="auto"/>
             </w:pPr>
@@ -311,7 +1307,7 @@
                 <w:b/>
                 <w:i w:val="0"/>
               </w:rPr>
-              <w:t>Réponse possible</w:t>
+              <w:t>En cours</w:t>
             </w:r>
           </w:p>
         </w:tc>
@@ -329,7 +1325,6 @@
           </w:tcPr>
           <w:p>
             <w:pPr>
-              <w:keepNext/>
               <w:keepLines/>
               <w:spacing w:after="40" w:line="252" w:lineRule="auto"/>
             </w:pPr>
@@ -361,7 +1356,6 @@
           </w:tcPr>
           <w:p>
             <w:pPr>
-              <w:keepNext/>
               <w:keepLines/>
               <w:spacing w:after="40" w:line="252" w:lineRule="auto"/>
             </w:pPr>
@@ -370,7 +1364,7 @@
                 <w:b/>
                 <w:i w:val="0"/>
               </w:rPr>
-              <w:t>Décrire</w:t>
+              <w:t>Décrit à partir de ce qui est visible</w:t>
             </w:r>
           </w:p>
         </w:tc>
@@ -387,7 +1381,6 @@
           </w:tcPr>
           <w:p>
             <w:pPr>
-              <w:keepNext/>
               <w:keepLines/>
               <w:spacing w:after="40" w:line="252" w:lineRule="auto"/>
             </w:pPr>
@@ -396,7 +1389,7 @@
                 <w:b w:val="0"/>
                 <w:i w:val="0"/>
               </w:rPr>
-              <w:t>Trois caractéristiques observables.</w:t>
+              <w:t>3 détails précis</w:t>
             </w:r>
           </w:p>
         </w:tc>
@@ -413,7 +1406,6 @@
           </w:tcPr>
           <w:p>
             <w:pPr>
-              <w:keepNext/>
               <w:keepLines/>
               <w:spacing w:after="40" w:line="252" w:lineRule="auto"/>
             </w:pPr>
@@ -422,337 +1414,7 @@
                 <w:b w:val="0"/>
                 <w:i w:val="0"/>
               </w:rPr>
-              <w:t>Arrondi, surfaces lisses, creux, reliefs.</w:t>
-            </w:r>
-          </w:p>
-        </w:tc>
-        <w:tc>
-          <w:tcPr>
-            <w:tcW w:type="dxa" w:w="2683"/>
-            <w:vAlign w:val="center"/>
-            <w:tcMar>
-              <w:top w:w="90" w:type="dxa"/>
-              <w:start w:w="120" w:type="dxa"/>
-              <w:bottom w:w="90" w:type="dxa"/>
-              <w:end w:w="120" w:type="dxa"/>
-            </w:tcMar>
-          </w:tcPr>
-          <w:p>
-            <w:pPr>
-              <w:keepNext/>
-              <w:keepLines/>
-              <w:spacing w:after="40" w:line="252" w:lineRule="auto"/>
-            </w:pPr>
-            <w:r>
-              <w:rPr>
-                <w:b w:val="0"/>
-                <w:i w:val="0"/>
-              </w:rPr>
-              <w:t>« C'est un os du pied » sans description.</w:t>
-            </w:r>
-          </w:p>
-        </w:tc>
-      </w:tr>
-      <w:tr>
-        <w:trPr>
-          <w:cantSplit/>
-        </w:trPr>
-        <w:tc>
-          <w:tcPr>
-            <w:tcW w:type="dxa" w:w="1857"/>
-            <w:vAlign w:val="center"/>
-            <w:shd w:fill="F0F1EE"/>
-            <w:tcMar>
-              <w:top w:w="90" w:type="dxa"/>
-              <w:start w:w="120" w:type="dxa"/>
-              <w:bottom w:w="90" w:type="dxa"/>
-              <w:end w:w="120" w:type="dxa"/>
-            </w:tcMar>
-          </w:tcPr>
-          <w:p>
-            <w:pPr>
-              <w:keepNext/>
-              <w:keepLines/>
-              <w:spacing w:after="40" w:line="252" w:lineRule="auto"/>
-            </w:pPr>
-            <w:r>
-              <w:rPr>
-                <w:b/>
-                <w:i w:val="0"/>
-              </w:rPr>
-              <w:t>Localiser</w:t>
-            </w:r>
-          </w:p>
-        </w:tc>
-        <w:tc>
-          <w:tcPr>
-            <w:tcW w:type="dxa" w:w="2889"/>
-            <w:vAlign w:val="center"/>
-            <w:tcMar>
-              <w:top w:w="90" w:type="dxa"/>
-              <w:start w:w="120" w:type="dxa"/>
-              <w:bottom w:w="90" w:type="dxa"/>
-              <w:end w:w="120" w:type="dxa"/>
-            </w:tcMar>
-          </w:tcPr>
-          <w:p>
-            <w:pPr>
-              <w:keepNext/>
-              <w:keepLines/>
-              <w:spacing w:after="40" w:line="252" w:lineRule="auto"/>
-            </w:pPr>
-            <w:r>
-              <w:rPr>
-                <w:b w:val="0"/>
-                <w:i w:val="0"/>
-              </w:rPr>
-              <w:t>Région du tarse, entre jambe et pied.</w:t>
-            </w:r>
-          </w:p>
-        </w:tc>
-        <w:tc>
-          <w:tcPr>
-            <w:tcW w:type="dxa" w:w="2889"/>
-            <w:vAlign w:val="center"/>
-            <w:tcMar>
-              <w:top w:w="90" w:type="dxa"/>
-              <w:start w:w="120" w:type="dxa"/>
-              <w:bottom w:w="90" w:type="dxa"/>
-              <w:end w:w="120" w:type="dxa"/>
-            </w:tcMar>
-          </w:tcPr>
-          <w:p>
-            <w:pPr>
-              <w:keepNext/>
-              <w:keepLines/>
-              <w:spacing w:after="40" w:line="252" w:lineRule="auto"/>
-            </w:pPr>
-            <w:r>
-              <w:rPr>
-                <w:b w:val="0"/>
-                <w:i w:val="0"/>
-              </w:rPr>
-              <w:t>« Près de la cheville, dans le pied » si justifié.</w:t>
-            </w:r>
-          </w:p>
-        </w:tc>
-        <w:tc>
-          <w:tcPr>
-            <w:tcW w:type="dxa" w:w="2683"/>
-            <w:vAlign w:val="center"/>
-            <w:tcMar>
-              <w:top w:w="90" w:type="dxa"/>
-              <w:start w:w="120" w:type="dxa"/>
-              <w:bottom w:w="90" w:type="dxa"/>
-              <w:end w:w="120" w:type="dxa"/>
-            </w:tcMar>
-          </w:tcPr>
-          <w:p>
-            <w:pPr>
-              <w:keepNext/>
-              <w:keepLines/>
-              <w:spacing w:after="40" w:line="252" w:lineRule="auto"/>
-            </w:pPr>
-            <w:r>
-              <w:rPr>
-                <w:b w:val="0"/>
-                <w:i w:val="0"/>
-              </w:rPr>
-              <w:t>« Dans le talon visible » sans nuance.</w:t>
-            </w:r>
-          </w:p>
-        </w:tc>
-      </w:tr>
-      <w:tr>
-        <w:trPr>
-          <w:cantSplit/>
-        </w:trPr>
-        <w:tc>
-          <w:tcPr>
-            <w:tcW w:type="dxa" w:w="1857"/>
-            <w:vAlign w:val="center"/>
-            <w:shd w:fill="F0F1EE"/>
-            <w:tcMar>
-              <w:top w:w="90" w:type="dxa"/>
-              <w:start w:w="120" w:type="dxa"/>
-              <w:bottom w:w="90" w:type="dxa"/>
-              <w:end w:w="120" w:type="dxa"/>
-            </w:tcMar>
-          </w:tcPr>
-          <w:p>
-            <w:pPr>
-              <w:keepNext/>
-              <w:keepLines/>
-              <w:spacing w:after="40" w:line="252" w:lineRule="auto"/>
-            </w:pPr>
-            <w:r>
-              <w:rPr>
-                <w:b/>
-                <w:i w:val="0"/>
-              </w:rPr>
-              <w:t>Justifier</w:t>
-            </w:r>
-          </w:p>
-        </w:tc>
-        <w:tc>
-          <w:tcPr>
-            <w:tcW w:type="dxa" w:w="2889"/>
-            <w:vAlign w:val="center"/>
-            <w:tcMar>
-              <w:top w:w="90" w:type="dxa"/>
-              <w:start w:w="120" w:type="dxa"/>
-              <w:bottom w:w="90" w:type="dxa"/>
-              <w:end w:w="120" w:type="dxa"/>
-            </w:tcMar>
-          </w:tcPr>
-          <w:p>
-            <w:pPr>
-              <w:keepNext/>
-              <w:keepLines/>
-              <w:spacing w:after="40" w:line="252" w:lineRule="auto"/>
-            </w:pPr>
-            <w:r>
-              <w:rPr>
-                <w:b w:val="0"/>
-                <w:i w:val="0"/>
-              </w:rPr>
-              <w:t>Deux indices reliés à la proposition.</w:t>
-            </w:r>
-          </w:p>
-        </w:tc>
-        <w:tc>
-          <w:tcPr>
-            <w:tcW w:type="dxa" w:w="2889"/>
-            <w:vAlign w:val="center"/>
-            <w:tcMar>
-              <w:top w:w="90" w:type="dxa"/>
-              <w:start w:w="120" w:type="dxa"/>
-              <w:bottom w:w="90" w:type="dxa"/>
-              <w:end w:w="120" w:type="dxa"/>
-            </w:tcMar>
-          </w:tcPr>
-          <w:p>
-            <w:pPr>
-              <w:keepNext/>
-              <w:keepLines/>
-              <w:spacing w:after="40" w:line="252" w:lineRule="auto"/>
-            </w:pPr>
-            <w:r>
-              <w:rPr>
-                <w:b w:val="0"/>
-                <w:i w:val="0"/>
-              </w:rPr>
-              <w:t>Position et surfaces articulaires.</w:t>
-            </w:r>
-          </w:p>
-        </w:tc>
-        <w:tc>
-          <w:tcPr>
-            <w:tcW w:type="dxa" w:w="2683"/>
-            <w:vAlign w:val="center"/>
-            <w:tcMar>
-              <w:top w:w="90" w:type="dxa"/>
-              <w:start w:w="120" w:type="dxa"/>
-              <w:bottom w:w="90" w:type="dxa"/>
-              <w:end w:w="120" w:type="dxa"/>
-            </w:tcMar>
-          </w:tcPr>
-          <w:p>
-            <w:pPr>
-              <w:keepNext/>
-              <w:keepLines/>
-              <w:spacing w:after="40" w:line="252" w:lineRule="auto"/>
-            </w:pPr>
-            <w:r>
-              <w:rPr>
-                <w:b w:val="0"/>
-                <w:i w:val="0"/>
-              </w:rPr>
-              <w:t>Ressemblance générale seule.</w:t>
-            </w:r>
-          </w:p>
-        </w:tc>
-      </w:tr>
-      <w:tr>
-        <w:trPr>
-          <w:cantSplit/>
-        </w:trPr>
-        <w:tc>
-          <w:tcPr>
-            <w:tcW w:type="dxa" w:w="1857"/>
-            <w:vAlign w:val="center"/>
-            <w:shd w:fill="F0F1EE"/>
-            <w:tcMar>
-              <w:top w:w="90" w:type="dxa"/>
-              <w:start w:w="120" w:type="dxa"/>
-              <w:bottom w:w="90" w:type="dxa"/>
-              <w:end w:w="120" w:type="dxa"/>
-            </w:tcMar>
-          </w:tcPr>
-          <w:p>
-            <w:pPr>
-              <w:keepNext/>
-              <w:keepLines/>
-              <w:spacing w:after="40" w:line="252" w:lineRule="auto"/>
-            </w:pPr>
-            <w:r>
-              <w:rPr>
-                <w:b/>
-                <w:i w:val="0"/>
-              </w:rPr>
-              <w:t>Comparer</w:t>
-            </w:r>
-          </w:p>
-        </w:tc>
-        <w:tc>
-          <w:tcPr>
-            <w:tcW w:type="dxa" w:w="2889"/>
-            <w:vAlign w:val="center"/>
-            <w:tcMar>
-              <w:top w:w="90" w:type="dxa"/>
-              <w:start w:w="120" w:type="dxa"/>
-              <w:bottom w:w="90" w:type="dxa"/>
-              <w:end w:w="120" w:type="dxa"/>
-            </w:tcMar>
-          </w:tcPr>
-          <w:p>
-            <w:pPr>
-              <w:keepNext/>
-              <w:keepLines/>
-              <w:spacing w:after="40" w:line="252" w:lineRule="auto"/>
-            </w:pPr>
-            <w:r>
-              <w:rPr>
-                <w:b w:val="0"/>
-                <w:i w:val="0"/>
-              </w:rPr>
-              <w:t>Une ressemblance et une différence.</w:t>
-            </w:r>
-          </w:p>
-        </w:tc>
-        <w:tc>
-          <w:tcPr>
-            <w:tcW w:type="dxa" w:w="2889"/>
-            <w:vAlign w:val="center"/>
-            <w:tcMar>
-              <w:top w:w="90" w:type="dxa"/>
-              <w:start w:w="120" w:type="dxa"/>
-              <w:bottom w:w="90" w:type="dxa"/>
-              <w:end w:w="120" w:type="dxa"/>
-            </w:tcMar>
-          </w:tcPr>
-          <w:p>
-            <w:pPr>
-              <w:keepNext/>
-              <w:keepLines/>
-              <w:spacing w:after="40" w:line="252" w:lineRule="auto"/>
-            </w:pPr>
-            <w:r>
-              <w:rPr>
-                <w:b w:val="0"/>
-                <w:i w:val="0"/>
-              </w:rPr>
-              <w:t>Os comparable, proportions différentes.</w:t>
+              <w:t>1-2 détails</w:t>
             </w:r>
           </w:p>
         </w:tc>
@@ -777,7 +1439,537 @@
                 <w:b w:val="0"/>
                 <w:i w:val="0"/>
               </w:rPr>
-              <w:t>« Tous les pieds sont identiques ».</w:t>
+              <w:t>Nom ou interprétation seule</w:t>
+            </w:r>
+          </w:p>
+        </w:tc>
+      </w:tr>
+      <w:tr>
+        <w:trPr>
+          <w:cantSplit/>
+        </w:trPr>
+        <w:tc>
+          <w:tcPr>
+            <w:tcW w:type="dxa" w:w="1857"/>
+            <w:vAlign w:val="center"/>
+            <w:shd w:fill="F0F1EE"/>
+            <w:tcMar>
+              <w:top w:w="90" w:type="dxa"/>
+              <w:start w:w="120" w:type="dxa"/>
+              <w:bottom w:w="90" w:type="dxa"/>
+              <w:end w:w="120" w:type="dxa"/>
+            </w:tcMar>
+          </w:tcPr>
+          <w:p>
+            <w:pPr>
+              <w:keepLines/>
+              <w:spacing w:after="40" w:line="252" w:lineRule="auto"/>
+            </w:pPr>
+            <w:r>
+              <w:rPr>
+                <w:b/>
+                <w:i w:val="0"/>
+              </w:rPr>
+              <w:t>Localise une zone précise</w:t>
+            </w:r>
+          </w:p>
+        </w:tc>
+        <w:tc>
+          <w:tcPr>
+            <w:tcW w:type="dxa" w:w="2889"/>
+            <w:vAlign w:val="center"/>
+            <w:tcMar>
+              <w:top w:w="90" w:type="dxa"/>
+              <w:start w:w="120" w:type="dxa"/>
+              <w:bottom w:w="90" w:type="dxa"/>
+              <w:end w:w="120" w:type="dxa"/>
+            </w:tcMar>
+          </w:tcPr>
+          <w:p>
+            <w:pPr>
+              <w:keepLines/>
+              <w:spacing w:after="40" w:line="252" w:lineRule="auto"/>
+            </w:pPr>
+            <w:r>
+              <w:rPr>
+                <w:b w:val="0"/>
+                <w:i w:val="0"/>
+              </w:rPr>
+              <w:t>Tarse sous la jambe</w:t>
+            </w:r>
+          </w:p>
+        </w:tc>
+        <w:tc>
+          <w:tcPr>
+            <w:tcW w:type="dxa" w:w="2889"/>
+            <w:vAlign w:val="center"/>
+            <w:tcMar>
+              <w:top w:w="90" w:type="dxa"/>
+              <w:start w:w="120" w:type="dxa"/>
+              <w:bottom w:w="90" w:type="dxa"/>
+              <w:end w:w="120" w:type="dxa"/>
+            </w:tcMar>
+          </w:tcPr>
+          <w:p>
+            <w:pPr>
+              <w:keepLines/>
+              <w:spacing w:after="40" w:line="252" w:lineRule="auto"/>
+            </w:pPr>
+            <w:r>
+              <w:rPr>
+                <w:b w:val="0"/>
+                <w:i w:val="0"/>
+              </w:rPr>
+              <w:t>Région proche</w:t>
+            </w:r>
+          </w:p>
+        </w:tc>
+        <w:tc>
+          <w:tcPr>
+            <w:tcW w:type="dxa" w:w="2683"/>
+            <w:vAlign w:val="center"/>
+            <w:tcMar>
+              <w:top w:w="90" w:type="dxa"/>
+              <w:start w:w="120" w:type="dxa"/>
+              <w:bottom w:w="90" w:type="dxa"/>
+              <w:end w:w="120" w:type="dxa"/>
+            </w:tcMar>
+          </w:tcPr>
+          <w:p>
+            <w:pPr>
+              <w:keepLines/>
+              <w:spacing w:after="40" w:line="252" w:lineRule="auto"/>
+            </w:pPr>
+            <w:r>
+              <w:rPr>
+                <w:b w:val="0"/>
+                <w:i w:val="0"/>
+              </w:rPr>
+              <w:t>Tout le pied ou autre région</w:t>
+            </w:r>
+          </w:p>
+        </w:tc>
+      </w:tr>
+      <w:tr>
+        <w:trPr>
+          <w:cantSplit/>
+        </w:trPr>
+        <w:tc>
+          <w:tcPr>
+            <w:tcW w:type="dxa" w:w="1857"/>
+            <w:vAlign w:val="center"/>
+            <w:shd w:fill="F0F1EE"/>
+            <w:tcMar>
+              <w:top w:w="90" w:type="dxa"/>
+              <w:start w:w="120" w:type="dxa"/>
+              <w:bottom w:w="90" w:type="dxa"/>
+              <w:end w:w="120" w:type="dxa"/>
+            </w:tcMar>
+          </w:tcPr>
+          <w:p>
+            <w:pPr>
+              <w:keepLines/>
+              <w:spacing w:after="40" w:line="252" w:lineRule="auto"/>
+            </w:pPr>
+            <w:r>
+              <w:rPr>
+                <w:b/>
+                <w:i w:val="0"/>
+              </w:rPr>
+              <w:t>Distingue talus, calcanéum et talon</w:t>
+            </w:r>
+          </w:p>
+        </w:tc>
+        <w:tc>
+          <w:tcPr>
+            <w:tcW w:type="dxa" w:w="2889"/>
+            <w:vAlign w:val="center"/>
+            <w:tcMar>
+              <w:top w:w="90" w:type="dxa"/>
+              <w:start w:w="120" w:type="dxa"/>
+              <w:bottom w:w="90" w:type="dxa"/>
+              <w:end w:w="120" w:type="dxa"/>
+            </w:tcMar>
+          </w:tcPr>
+          <w:p>
+            <w:pPr>
+              <w:keepLines/>
+              <w:spacing w:after="40" w:line="252" w:lineRule="auto"/>
+            </w:pPr>
+            <w:r>
+              <w:rPr>
+                <w:b w:val="0"/>
+                <w:i w:val="0"/>
+              </w:rPr>
+              <w:t>3 notions distinguées</w:t>
+            </w:r>
+          </w:p>
+        </w:tc>
+        <w:tc>
+          <w:tcPr>
+            <w:tcW w:type="dxa" w:w="2889"/>
+            <w:vAlign w:val="center"/>
+            <w:tcMar>
+              <w:top w:w="90" w:type="dxa"/>
+              <w:start w:w="120" w:type="dxa"/>
+              <w:bottom w:w="90" w:type="dxa"/>
+              <w:end w:w="120" w:type="dxa"/>
+            </w:tcMar>
+          </w:tcPr>
+          <w:p>
+            <w:pPr>
+              <w:keepLines/>
+              <w:spacing w:after="40" w:line="252" w:lineRule="auto"/>
+            </w:pPr>
+            <w:r>
+              <w:rPr>
+                <w:b w:val="0"/>
+                <w:i w:val="0"/>
+              </w:rPr>
+              <w:t>Une hésitation</w:t>
+            </w:r>
+          </w:p>
+        </w:tc>
+        <w:tc>
+          <w:tcPr>
+            <w:tcW w:type="dxa" w:w="2683"/>
+            <w:vAlign w:val="center"/>
+            <w:tcMar>
+              <w:top w:w="90" w:type="dxa"/>
+              <w:start w:w="120" w:type="dxa"/>
+              <w:bottom w:w="90" w:type="dxa"/>
+              <w:end w:w="120" w:type="dxa"/>
+            </w:tcMar>
+          </w:tcPr>
+          <w:p>
+            <w:pPr>
+              <w:keepLines/>
+              <w:spacing w:after="40" w:line="252" w:lineRule="auto"/>
+            </w:pPr>
+            <w:r>
+              <w:rPr>
+                <w:b w:val="0"/>
+                <w:i w:val="0"/>
+              </w:rPr>
+              <w:t>Notions confondues</w:t>
+            </w:r>
+          </w:p>
+        </w:tc>
+      </w:tr>
+      <w:tr>
+        <w:trPr>
+          <w:cantSplit/>
+        </w:trPr>
+        <w:tc>
+          <w:tcPr>
+            <w:tcW w:type="dxa" w:w="1857"/>
+            <w:vAlign w:val="center"/>
+            <w:shd w:fill="F0F1EE"/>
+            <w:tcMar>
+              <w:top w:w="90" w:type="dxa"/>
+              <w:start w:w="120" w:type="dxa"/>
+              <w:bottom w:w="90" w:type="dxa"/>
+              <w:end w:w="120" w:type="dxa"/>
+            </w:tcMar>
+          </w:tcPr>
+          <w:p>
+            <w:pPr>
+              <w:keepLines/>
+              <w:spacing w:after="40" w:line="252" w:lineRule="auto"/>
+            </w:pPr>
+            <w:r>
+              <w:rPr>
+                <w:b/>
+                <w:i w:val="0"/>
+              </w:rPr>
+              <w:t>Utilise deux indices</w:t>
+            </w:r>
+          </w:p>
+        </w:tc>
+        <w:tc>
+          <w:tcPr>
+            <w:tcW w:type="dxa" w:w="2889"/>
+            <w:vAlign w:val="center"/>
+            <w:tcMar>
+              <w:top w:w="90" w:type="dxa"/>
+              <w:start w:w="120" w:type="dxa"/>
+              <w:bottom w:w="90" w:type="dxa"/>
+              <w:end w:w="120" w:type="dxa"/>
+            </w:tcMar>
+          </w:tcPr>
+          <w:p>
+            <w:pPr>
+              <w:keepLines/>
+              <w:spacing w:after="40" w:line="252" w:lineRule="auto"/>
+            </w:pPr>
+            <w:r>
+              <w:rPr>
+                <w:b w:val="0"/>
+                <w:i w:val="0"/>
+              </w:rPr>
+              <w:t>2 indices distincts</w:t>
+            </w:r>
+          </w:p>
+        </w:tc>
+        <w:tc>
+          <w:tcPr>
+            <w:tcW w:type="dxa" w:w="2889"/>
+            <w:vAlign w:val="center"/>
+            <w:tcMar>
+              <w:top w:w="90" w:type="dxa"/>
+              <w:start w:w="120" w:type="dxa"/>
+              <w:bottom w:w="90" w:type="dxa"/>
+              <w:end w:w="120" w:type="dxa"/>
+            </w:tcMar>
+          </w:tcPr>
+          <w:p>
+            <w:pPr>
+              <w:keepLines/>
+              <w:spacing w:after="40" w:line="252" w:lineRule="auto"/>
+            </w:pPr>
+            <w:r>
+              <w:rPr>
+                <w:b w:val="0"/>
+                <w:i w:val="0"/>
+              </w:rPr>
+              <w:t>1 indice</w:t>
+            </w:r>
+          </w:p>
+        </w:tc>
+        <w:tc>
+          <w:tcPr>
+            <w:tcW w:type="dxa" w:w="2683"/>
+            <w:vAlign w:val="center"/>
+            <w:tcMar>
+              <w:top w:w="90" w:type="dxa"/>
+              <w:start w:w="120" w:type="dxa"/>
+              <w:bottom w:w="90" w:type="dxa"/>
+              <w:end w:w="120" w:type="dxa"/>
+            </w:tcMar>
+          </w:tcPr>
+          <w:p>
+            <w:pPr>
+              <w:keepLines/>
+              <w:spacing w:after="40" w:line="252" w:lineRule="auto"/>
+            </w:pPr>
+            <w:r>
+              <w:rPr>
+                <w:b w:val="0"/>
+                <w:i w:val="0"/>
+              </w:rPr>
+              <w:t>Aucun indice visible</w:t>
+            </w:r>
+          </w:p>
+        </w:tc>
+      </w:tr>
+      <w:tr>
+        <w:trPr>
+          <w:cantSplit/>
+        </w:trPr>
+        <w:tc>
+          <w:tcPr>
+            <w:tcW w:type="dxa" w:w="1857"/>
+            <w:vAlign w:val="center"/>
+            <w:shd w:fill="F0F1EE"/>
+            <w:tcMar>
+              <w:top w:w="90" w:type="dxa"/>
+              <w:start w:w="120" w:type="dxa"/>
+              <w:bottom w:w="90" w:type="dxa"/>
+              <w:end w:w="120" w:type="dxa"/>
+            </w:tcMar>
+          </w:tcPr>
+          <w:p>
+            <w:pPr>
+              <w:keepLines/>
+              <w:spacing w:after="40" w:line="252" w:lineRule="auto"/>
+            </w:pPr>
+            <w:r>
+              <w:rPr>
+                <w:b/>
+                <w:i w:val="0"/>
+              </w:rPr>
+              <w:t>Formule avec prudence</w:t>
+            </w:r>
+          </w:p>
+        </w:tc>
+        <w:tc>
+          <w:tcPr>
+            <w:tcW w:type="dxa" w:w="2889"/>
+            <w:vAlign w:val="center"/>
+            <w:tcMar>
+              <w:top w:w="90" w:type="dxa"/>
+              <w:start w:w="120" w:type="dxa"/>
+              <w:bottom w:w="90" w:type="dxa"/>
+              <w:end w:w="120" w:type="dxa"/>
+            </w:tcMar>
+          </w:tcPr>
+          <w:p>
+            <w:pPr>
+              <w:keepLines/>
+              <w:spacing w:after="40" w:line="252" w:lineRule="auto"/>
+            </w:pPr>
+            <w:r>
+              <w:rPr>
+                <w:b w:val="0"/>
+                <w:i w:val="0"/>
+              </w:rPr>
+              <w:t>Certitude qualifiée</w:t>
+            </w:r>
+          </w:p>
+        </w:tc>
+        <w:tc>
+          <w:tcPr>
+            <w:tcW w:type="dxa" w:w="2889"/>
+            <w:vAlign w:val="center"/>
+            <w:tcMar>
+              <w:top w:w="90" w:type="dxa"/>
+              <w:start w:w="120" w:type="dxa"/>
+              <w:bottom w:w="90" w:type="dxa"/>
+              <w:end w:w="120" w:type="dxa"/>
+            </w:tcMar>
+          </w:tcPr>
+          <w:p>
+            <w:pPr>
+              <w:keepLines/>
+              <w:spacing w:after="40" w:line="252" w:lineRule="auto"/>
+            </w:pPr>
+            <w:r>
+              <w:rPr>
+                <w:b w:val="0"/>
+                <w:i w:val="0"/>
+              </w:rPr>
+              <w:t>Limite implicite</w:t>
+            </w:r>
+          </w:p>
+        </w:tc>
+        <w:tc>
+          <w:tcPr>
+            <w:tcW w:type="dxa" w:w="2683"/>
+            <w:vAlign w:val="center"/>
+            <w:tcMar>
+              <w:top w:w="90" w:type="dxa"/>
+              <w:start w:w="120" w:type="dxa"/>
+              <w:bottom w:w="90" w:type="dxa"/>
+              <w:end w:w="120" w:type="dxa"/>
+            </w:tcMar>
+          </w:tcPr>
+          <w:p>
+            <w:pPr>
+              <w:keepLines/>
+              <w:spacing w:after="40" w:line="252" w:lineRule="auto"/>
+            </w:pPr>
+            <w:r>
+              <w:rPr>
+                <w:b w:val="0"/>
+                <w:i w:val="0"/>
+              </w:rPr>
+              <w:t>Affirmation sans limite</w:t>
+            </w:r>
+          </w:p>
+        </w:tc>
+      </w:tr>
+      <w:tr>
+        <w:trPr>
+          <w:cantSplit/>
+        </w:trPr>
+        <w:tc>
+          <w:tcPr>
+            <w:tcW w:type="dxa" w:w="1857"/>
+            <w:vAlign w:val="center"/>
+            <w:shd w:fill="F0F1EE"/>
+            <w:tcMar>
+              <w:top w:w="90" w:type="dxa"/>
+              <w:start w:w="120" w:type="dxa"/>
+              <w:bottom w:w="90" w:type="dxa"/>
+              <w:end w:w="120" w:type="dxa"/>
+            </w:tcMar>
+          </w:tcPr>
+          <w:p>
+            <w:pPr>
+              <w:keepLines/>
+              <w:spacing w:after="40" w:line="252" w:lineRule="auto"/>
+            </w:pPr>
+            <w:r>
+              <w:rPr>
+                <w:b/>
+                <w:i w:val="0"/>
+              </w:rPr>
+              <w:t>Transfère la méthode</w:t>
+            </w:r>
+          </w:p>
+        </w:tc>
+        <w:tc>
+          <w:tcPr>
+            <w:tcW w:type="dxa" w:w="2889"/>
+            <w:vAlign w:val="center"/>
+            <w:tcMar>
+              <w:top w:w="90" w:type="dxa"/>
+              <w:start w:w="120" w:type="dxa"/>
+              <w:bottom w:w="90" w:type="dxa"/>
+              <w:end w:w="120" w:type="dxa"/>
+            </w:tcMar>
+          </w:tcPr>
+          <w:p>
+            <w:pPr>
+              <w:keepLines/>
+              <w:spacing w:after="40" w:line="252" w:lineRule="auto"/>
+            </w:pPr>
+            <w:r>
+              <w:rPr>
+                <w:b w:val="0"/>
+                <w:i w:val="0"/>
+              </w:rPr>
+              <w:t>Ressemblance, différence, limite</w:t>
+            </w:r>
+          </w:p>
+        </w:tc>
+        <w:tc>
+          <w:tcPr>
+            <w:tcW w:type="dxa" w:w="2889"/>
+            <w:vAlign w:val="center"/>
+            <w:tcMar>
+              <w:top w:w="90" w:type="dxa"/>
+              <w:start w:w="120" w:type="dxa"/>
+              <w:bottom w:w="90" w:type="dxa"/>
+              <w:end w:w="120" w:type="dxa"/>
+            </w:tcMar>
+          </w:tcPr>
+          <w:p>
+            <w:pPr>
+              <w:keepLines/>
+              <w:spacing w:after="40" w:line="252" w:lineRule="auto"/>
+            </w:pPr>
+            <w:r>
+              <w:rPr>
+                <w:b w:val="0"/>
+                <w:i w:val="0"/>
+              </w:rPr>
+              <w:t>Deux éléments sur trois</w:t>
+            </w:r>
+          </w:p>
+        </w:tc>
+        <w:tc>
+          <w:tcPr>
+            <w:tcW w:type="dxa" w:w="2683"/>
+            <w:vAlign w:val="center"/>
+            <w:tcMar>
+              <w:top w:w="90" w:type="dxa"/>
+              <w:start w:w="120" w:type="dxa"/>
+              <w:bottom w:w="90" w:type="dxa"/>
+              <w:end w:w="120" w:type="dxa"/>
+            </w:tcMar>
+          </w:tcPr>
+          <w:p>
+            <w:pPr>
+              <w:keepLines/>
+              <w:spacing w:after="40" w:line="252" w:lineRule="auto"/>
+            </w:pPr>
+            <w:r>
+              <w:rPr>
+                <w:b w:val="0"/>
+                <w:i w:val="0"/>
+              </w:rPr>
+              <w:t>Ressemblance prise pour preuve</w:t>
             </w:r>
           </w:p>
         </w:tc>
@@ -799,7 +1991,7 @@
           <w:b w:val="0"/>
           <w:i w:val="0"/>
         </w:rPr>
-        <w:t>Formulations adaptées aux élèves</w:t>
+        <w:t>Formulations utiles</w:t>
       </w:r>
     </w:p>
     <w:tbl>
@@ -817,19 +2009,19 @@
       <w:tr>
         <w:trPr>
           <w:cantSplit/>
-          <w:cantSplit/>
+          <w:tblHeader w:val="true"/>
         </w:trPr>
         <w:tc>
           <w:tcPr>
             <w:tcW w:type="dxa" w:w="5159"/>
             <w:vAlign w:val="top"/>
-            <w:shd w:fill="F7F4EF"/>
             <w:tcMar>
               <w:top w:w="90" w:type="dxa"/>
               <w:start w:w="120" w:type="dxa"/>
               <w:bottom w:w="90" w:type="dxa"/>
               <w:end w:w="120" w:type="dxa"/>
             </w:tcMar>
+            <w:shd w:fill="F0F1EE"/>
           </w:tcPr>
           <w:p>
             <w:pPr>
@@ -841,19 +2033,7 @@
                 <w:b w:val="0"/>
                 <w:i w:val="0"/>
               </w:rPr>
-              <w:t>Réponse solide</w:t>
-            </w:r>
-          </w:p>
-          <w:p>
-            <w:pPr>
-              <w:keepLines/>
-            </w:pPr>
-            <w:r>
-              <w:rPr>
-                <w:b w:val="0"/>
-                <w:i w:val="0"/>
-              </w:rPr>
-              <w:t>« Je pense que l'os se trouve dans le tarse, car il est placé entre la jambe et le pied et possède plusieurs surfaces lisses qui s'articulent avec d'autres os. »</w:t>
+              <w:t>À dire</w:t>
             </w:r>
           </w:p>
         </w:tc>
@@ -861,13 +2041,13 @@
           <w:tcPr>
             <w:tcW w:type="dxa" w:w="5159"/>
             <w:vAlign w:val="top"/>
-            <w:shd w:fill="F7F4EF"/>
             <w:tcMar>
               <w:top w:w="90" w:type="dxa"/>
               <w:start w:w="120" w:type="dxa"/>
               <w:bottom w:w="90" w:type="dxa"/>
               <w:end w:w="120" w:type="dxa"/>
             </w:tcMar>
+            <w:shd w:fill="F0F1EE"/>
           </w:tcPr>
           <w:p>
             <w:pPr>
@@ -879,9 +2059,27 @@
                 <w:b w:val="0"/>
                 <w:i w:val="0"/>
               </w:rPr>
-              <w:t>Réponse prudente</w:t>
+              <w:t>À éviter</w:t>
             </w:r>
           </w:p>
+        </w:tc>
+      </w:tr>
+      <w:tr>
+        <w:trPr>
+          <w:cantSplit/>
+        </w:trPr>
+        <w:tc>
+          <w:tcPr>
+            <w:tcW w:type="dxa" w:w="5159"/>
+            <w:vAlign w:val="top"/>
+            <w:tcMar>
+              <w:top w:w="90" w:type="dxa"/>
+              <w:start w:w="120" w:type="dxa"/>
+              <w:bottom w:w="90" w:type="dxa"/>
+              <w:end w:w="120" w:type="dxa"/>
+            </w:tcMar>
+            <w:shd w:fill="F7F4EF"/>
+          </w:tcPr>
           <w:p>
             <w:pPr>
               <w:keepLines/>
@@ -891,7 +2089,32 @@
                 <w:b w:val="0"/>
                 <w:i w:val="0"/>
               </w:rPr>
-              <w:t>« Cette zone est probable, mais je voudrais comparer avec un squelette complet pour vérifier. »</w:t>
+              <w:t>« Le talus, aussi appelé astragale dans le projet, est un os du tarse. Il se trouve sous les os de la jambe et au-dessus du calcanéum. »</w:t>
+            </w:r>
+          </w:p>
+        </w:tc>
+        <w:tc>
+          <w:tcPr>
+            <w:tcW w:type="dxa" w:w="5159"/>
+            <w:vAlign w:val="top"/>
+            <w:tcMar>
+              <w:top w:w="90" w:type="dxa"/>
+              <w:start w:w="120" w:type="dxa"/>
+              <w:bottom w:w="90" w:type="dxa"/>
+              <w:end w:w="120" w:type="dxa"/>
+            </w:tcMar>
+            <w:shd w:fill="F7F4EF"/>
+          </w:tcPr>
+          <w:p>
+            <w:pPr>
+              <w:keepLines/>
+            </w:pPr>
+            <w:r>
+              <w:rPr>
+                <w:b w:val="0"/>
+                <w:i w:val="0"/>
+              </w:rPr>
+              <w:t>« Le talus est le talon », « c'est un petit os compact » ou « la ressemblance suffit à l'identifier ».</w:t>
             </w:r>
           </w:p>
         </w:tc>
@@ -913,84 +2136,7 @@
           <w:b w:val="0"/>
           <w:i w:val="0"/>
         </w:rPr>
-        <w:t>Erreurs fréquentes et correction</w:t>
-      </w:r>
-    </w:p>
-    <w:p>
-      <w:pPr>
-        <w:pStyle w:val="ListBullet"/>
-        <w:keepNext/>
-        <w:keepLines/>
-      </w:pPr>
-      <w:r>
-        <w:rPr>
-          <w:b/>
-          <w:i w:val="0"/>
-        </w:rPr>
-        <w:t>Talus = talon visible :</w:t>
-      </w:r>
-      <w:r>
-        <w:rPr>
-          <w:b w:val="0"/>
-          <w:i w:val="0"/>
-        </w:rPr>
-        <w:t xml:space="preserve"> rappeler que le talus est un os profond du tarse.</w:t>
-      </w:r>
-    </w:p>
-    <w:p>
-      <w:pPr>
-        <w:pStyle w:val="ListBullet"/>
-        <w:keepNext/>
-        <w:keepLines/>
-      </w:pPr>
-      <w:r>
-        <w:rPr>
-          <w:b/>
-          <w:i w:val="0"/>
-        </w:rPr>
-        <w:t>Une seule image suffit :</w:t>
-      </w:r>
-      <w:r>
-        <w:rPr>
-          <w:b w:val="0"/>
-          <w:i w:val="0"/>
-        </w:rPr>
-        <w:t xml:space="preserve"> comparer plusieurs vues avant de conclure.</w:t>
-      </w:r>
-    </w:p>
-    <w:p>
-      <w:pPr>
-        <w:pStyle w:val="ListBullet"/>
-        <w:keepNext w:val="0"/>
-        <w:keepLines/>
-      </w:pPr>
-      <w:r>
-        <w:rPr>
-          <w:b/>
-          <w:i w:val="0"/>
-        </w:rPr>
-        <w:t>Ressemblance = preuve :</w:t>
-      </w:r>
-      <w:r>
-        <w:rPr>
-          <w:b w:val="0"/>
-          <w:i w:val="0"/>
-        </w:rPr>
-        <w:t xml:space="preserve"> demander un second indice et une référence.</w:t>
-      </w:r>
-    </w:p>
-    <w:p>
-      <w:pPr>
-        <w:pStyle w:val="Heading2"/>
-        <w:keepNext/>
-        <w:keepLines/>
-      </w:pPr>
-      <w:r>
-        <w:rPr>
-          <w:b w:val="0"/>
-          <w:i w:val="0"/>
-        </w:rPr>
-        <w:t>Limites scientifiques</w:t>
+        <w:t>Décision pédagogique</w:t>
       </w:r>
     </w:p>
     <w:p>
@@ -1002,23 +2148,7 @@
           <w:b w:val="0"/>
           <w:i w:val="0"/>
         </w:rPr>
-        <w:t>La fiche permet un repérage anatomique introductif. Elle ne remplace ni une formation anatomique ni un corpus ostéologique de référence. Le vocabulaire talus/astragale est volontairement expliqué ; la terminologie dépend du contexte anatomique, historique ou archéologique.</w:t>
-      </w:r>
-    </w:p>
-    <w:p>
-      <w:pPr>
-        <w:keepLines/>
-        <w:shd w:fill="F7F4EF"/>
-        <w:pBdr>
-          <w:left w:val="single" w:sz="18" w:space="8" w:color="9A5B25"/>
-        </w:pBdr>
-      </w:pPr>
-      <w:r>
-        <w:rPr>
-          <w:b w:val="0"/>
-          <w:i w:val="0"/>
-        </w:rPr>
-        <w:t>Faire relire les formulations finales, tester la compréhension par des élèves et confirmer le choix du futur schéma anatomique du projet.</w:t>
+        <w:t>Ne pas retirer des points pour un terme oublié si la méthode est comprise. Autoriser une correction après révélation : réviser une hypothèse à partir de nouveaux indices fait partie de la réussite.</w:t>
       </w:r>
     </w:p>
     <w:p>
@@ -1038,7 +2168,7 @@
             <w:color w:val="9A5B25"/>
             <w:u w:val="single"/>
           </w:rPr>
-          <w:t>https://histoire-d-os.github.io/Histoire-d-os/ressources/activite-01-trouver-astragale.html</w:t>
+          <w:t>Page de l'activité, mises à jour et crédits en ligne</w:t>
         </w:r>
       </w:hyperlink>
     </w:p>
@@ -1313,7 +2443,7 @@
         <w:rFonts w:asciiTheme="minorHAnsi" w:eastAsiaTheme="minorEastAsia" w:hAnsiTheme="minorHAnsi" w:cstheme="minorBidi"/>
         <w:sz w:val="22"/>
         <w:szCs w:val="22"/>
-        <w:lang w:val="en-US" w:eastAsia="en-US" w:bidi="ar-SA"/>
+        <w:lang w:val="fr-FR" w:eastAsia="fr-FR" w:bidi="fr-FR"/>
       </w:rPr>
     </w:rPrDefault>
     <w:pPrDefault>
@@ -1472,6 +2602,7 @@
       <w:rFonts w:ascii="Arial" w:hAnsi="Arial"/>
       <w:color w:val="1F2523"/>
       <w:sz w:val="21"/>
+      <w:lang w:val="fr-FR" w:eastAsia="fr-FR" w:bidi="fr-FR"/>
     </w:rPr>
   </w:style>
   <w:style w:type="paragraph" w:styleId="Header">
@@ -1488,6 +2619,9 @@
       </w:tabs>
       <w:spacing w:after="0" w:line="240" w:lineRule="auto"/>
     </w:pPr>
+    <w:rPr>
+      <w:lang w:val="fr-FR" w:eastAsia="fr-FR" w:bidi="fr-FR"/>
+    </w:rPr>
   </w:style>
   <w:style w:type="character" w:customStyle="1" w:styleId="HeaderChar">
     <w:name w:val="Header Char"/>
@@ -1495,6 +2629,9 @@
     <w:link w:val="Header"/>
     <w:uiPriority w:val="99"/>
     <w:rsid w:val="00E618BF"/>
+    <w:rPr>
+      <w:lang w:val="fr-FR" w:eastAsia="fr-FR" w:bidi="fr-FR"/>
+    </w:rPr>
   </w:style>
   <w:style w:type="paragraph" w:styleId="Footer">
     <w:name w:val="footer"/>
@@ -1510,6 +2647,9 @@
       </w:tabs>
       <w:spacing w:after="0" w:line="240" w:lineRule="auto"/>
     </w:pPr>
+    <w:rPr>
+      <w:lang w:val="fr-FR" w:eastAsia="fr-FR" w:bidi="fr-FR"/>
+    </w:rPr>
   </w:style>
   <w:style w:type="character" w:customStyle="1" w:styleId="FooterChar">
     <w:name w:val="Footer Char"/>
@@ -1517,6 +2657,9 @@
     <w:link w:val="Footer"/>
     <w:uiPriority w:val="99"/>
     <w:rsid w:val="00E618BF"/>
+    <w:rPr>
+      <w:lang w:val="fr-FR" w:eastAsia="fr-FR" w:bidi="fr-FR"/>
+    </w:rPr>
   </w:style>
   <w:style w:type="paragraph" w:styleId="Heading1">
     <w:name w:val="heading 1"/>
@@ -1539,6 +2682,7 @@
       <w:color w:val="1F2523"/>
       <w:sz w:val="44"/>
       <w:szCs w:val="28"/>
+      <w:lang w:val="fr-FR" w:eastAsia="fr-FR" w:bidi="fr-FR"/>
     </w:rPr>
   </w:style>
   <w:style w:type="paragraph" w:styleId="Heading2">
@@ -1563,6 +2707,7 @@
       <w:color w:val="9A5B25"/>
       <w:sz w:val="28"/>
       <w:szCs w:val="26"/>
+      <w:lang w:val="fr-FR" w:eastAsia="fr-FR" w:bidi="fr-FR"/>
     </w:rPr>
   </w:style>
   <w:style w:type="paragraph" w:styleId="Heading3">
@@ -1586,6 +2731,7 @@
       <w:bCs/>
       <w:color w:val="1F2523"/>
       <w:sz w:val="23"/>
+      <w:lang w:val="fr-FR" w:eastAsia="fr-FR" w:bidi="fr-FR"/>
     </w:rPr>
   </w:style>
   <w:style w:type="paragraph" w:styleId="Heading4">
@@ -1611,6 +2757,7 @@
       <w:i/>
       <w:iCs/>
       <w:color w:val="4F81BD" w:themeColor="accent1"/>
+      <w:lang w:val="fr-FR" w:eastAsia="fr-FR" w:bidi="fr-FR"/>
     </w:rPr>
   </w:style>
   <w:style w:type="paragraph" w:styleId="Heading5">
@@ -1632,6 +2779,7 @@
     <w:rPr>
       <w:rFonts w:asciiTheme="majorHAnsi" w:eastAsiaTheme="majorEastAsia" w:hAnsiTheme="majorHAnsi" w:cstheme="majorBidi"/>
       <w:color w:val="243F60" w:themeColor="accent1" w:themeShade="7F"/>
+      <w:lang w:val="fr-FR" w:eastAsia="fr-FR" w:bidi="fr-FR"/>
     </w:rPr>
   </w:style>
   <w:style w:type="paragraph" w:styleId="Heading6">
@@ -1655,6 +2803,7 @@
       <w:i/>
       <w:iCs/>
       <w:color w:val="243F60" w:themeColor="accent1" w:themeShade="7F"/>
+      <w:lang w:val="fr-FR" w:eastAsia="fr-FR" w:bidi="fr-FR"/>
     </w:rPr>
   </w:style>
   <w:style w:type="paragraph" w:styleId="Heading7">
@@ -1678,6 +2827,7 @@
       <w:i/>
       <w:iCs/>
       <w:color w:val="404040" w:themeColor="text1" w:themeTint="BF"/>
+      <w:lang w:val="fr-FR" w:eastAsia="fr-FR" w:bidi="fr-FR"/>
     </w:rPr>
   </w:style>
   <w:style w:type="paragraph" w:styleId="Heading8">
@@ -1701,6 +2851,7 @@
       <w:color w:val="4F81BD" w:themeColor="accent1"/>
       <w:sz w:val="20"/>
       <w:szCs w:val="20"/>
+      <w:lang w:val="fr-FR" w:eastAsia="fr-FR" w:bidi="fr-FR"/>
     </w:rPr>
   </w:style>
   <w:style w:type="paragraph" w:styleId="Heading9">
@@ -1726,6 +2877,7 @@
       <w:color w:val="404040" w:themeColor="text1" w:themeTint="BF"/>
       <w:sz w:val="20"/>
       <w:szCs w:val="20"/>
+      <w:lang w:val="fr-FR" w:eastAsia="fr-FR" w:bidi="fr-FR"/>
     </w:rPr>
   </w:style>
   <w:style w:type="character" w:default="1" w:styleId="DefaultParagraphFont">
@@ -1733,12 +2885,18 @@
     <w:uiPriority w:val="1"/>
     <w:semiHidden/>
     <w:unhideWhenUsed/>
+    <w:rPr>
+      <w:lang w:val="fr-FR" w:eastAsia="fr-FR" w:bidi="fr-FR"/>
+    </w:rPr>
   </w:style>
   <w:style w:type="table" w:default="1" w:styleId="TableNormal">
     <w:name w:val="Normal Table"/>
     <w:uiPriority w:val="99"/>
     <w:semiHidden/>
     <w:unhideWhenUsed/>
+    <w:rPr>
+      <w:lang w:val="fr-FR" w:eastAsia="fr-FR" w:bidi="fr-FR"/>
+    </w:rPr>
     <w:tblPr>
       <w:tblInd w:w="0" w:type="dxa"/>
       <w:tblCellMar>
@@ -1754,6 +2912,9 @@
     <w:uiPriority w:val="99"/>
     <w:semiHidden/>
     <w:unhideWhenUsed/>
+    <w:rPr>
+      <w:lang w:val="fr-FR" w:eastAsia="fr-FR" w:bidi="fr-FR"/>
+    </w:rPr>
   </w:style>
   <w:style w:type="paragraph" w:styleId="NoSpacing">
     <w:name w:val="No Spacing"/>
@@ -1763,6 +2924,9 @@
     <w:pPr>
       <w:spacing w:after="0" w:line="240" w:lineRule="auto"/>
     </w:pPr>
+    <w:rPr>
+      <w:lang w:val="fr-FR" w:eastAsia="fr-FR" w:bidi="fr-FR"/>
+    </w:rPr>
   </w:style>
   <w:style w:type="character" w:customStyle="1" w:styleId="Heading1Char">
     <w:name w:val="Heading 1 Char"/>
@@ -1777,6 +2941,7 @@
       <w:color w:val="365F91" w:themeColor="accent1" w:themeShade="BF"/>
       <w:sz w:val="28"/>
       <w:szCs w:val="28"/>
+      <w:lang w:val="fr-FR" w:eastAsia="fr-FR" w:bidi="fr-FR"/>
     </w:rPr>
   </w:style>
   <w:style w:type="character" w:customStyle="1" w:styleId="Heading2Char">
@@ -1792,6 +2957,7 @@
       <w:color w:val="4F81BD" w:themeColor="accent1"/>
       <w:sz w:val="26"/>
       <w:szCs w:val="26"/>
+      <w:lang w:val="fr-FR" w:eastAsia="fr-FR" w:bidi="fr-FR"/>
     </w:rPr>
   </w:style>
   <w:style w:type="character" w:customStyle="1" w:styleId="Heading3Char">
@@ -1805,6 +2971,7 @@
       <w:b/>
       <w:bCs/>
       <w:color w:val="4F81BD" w:themeColor="accent1"/>
+      <w:lang w:val="fr-FR" w:eastAsia="fr-FR" w:bidi="fr-FR"/>
     </w:rPr>
   </w:style>
   <w:style w:type="paragraph" w:styleId="Title">
@@ -1831,6 +2998,7 @@
       <w:kern w:val="28"/>
       <w:sz w:val="56"/>
       <w:szCs w:val="52"/>
+      <w:lang w:val="fr-FR" w:eastAsia="fr-FR" w:bidi="fr-FR"/>
     </w:rPr>
   </w:style>
   <w:style w:type="character" w:customStyle="1" w:styleId="TitleChar">
@@ -1846,6 +3014,7 @@
       <w:kern w:val="28"/>
       <w:sz w:val="52"/>
       <w:szCs w:val="52"/>
+      <w:lang w:val="fr-FR" w:eastAsia="fr-FR" w:bidi="fr-FR"/>
     </w:rPr>
   </w:style>
   <w:style w:type="paragraph" w:styleId="Subtitle">
@@ -1869,6 +3038,7 @@
       <w:spacing w:val="15"/>
       <w:sz w:val="24"/>
       <w:szCs w:val="24"/>
+      <w:lang w:val="fr-FR" w:eastAsia="fr-FR" w:bidi="fr-FR"/>
     </w:rPr>
   </w:style>
   <w:style w:type="character" w:customStyle="1" w:styleId="SubtitleChar">
@@ -1885,6 +3055,7 @@
       <w:spacing w:val="15"/>
       <w:sz w:val="24"/>
       <w:szCs w:val="24"/>
+      <w:lang w:val="fr-FR" w:eastAsia="fr-FR" w:bidi="fr-FR"/>
     </w:rPr>
   </w:style>
   <w:style w:type="paragraph" w:styleId="ListParagraph">
@@ -1897,6 +3068,9 @@
       <w:ind w:left="720"/>
       <w:contextualSpacing/>
     </w:pPr>
+    <w:rPr>
+      <w:lang w:val="fr-FR" w:eastAsia="fr-FR" w:bidi="fr-FR"/>
+    </w:rPr>
   </w:style>
   <w:style w:type="paragraph" w:styleId="BodyText">
     <w:name w:val="Body Text"/>
@@ -1908,6 +3082,9 @@
     <w:pPr>
       <w:spacing w:after="120"/>
     </w:pPr>
+    <w:rPr>
+      <w:lang w:val="fr-FR" w:eastAsia="fr-FR" w:bidi="fr-FR"/>
+    </w:rPr>
   </w:style>
   <w:style w:type="character" w:customStyle="1" w:styleId="BodyTextChar">
     <w:name w:val="Body Text Char"/>
@@ -1915,6 +3092,9 @@
     <w:link w:val="BodyText"/>
     <w:uiPriority w:val="99"/>
     <w:rsid w:val="00AA1D8D"/>
+    <w:rPr>
+      <w:lang w:val="fr-FR" w:eastAsia="fr-FR" w:bidi="fr-FR"/>
+    </w:rPr>
   </w:style>
   <w:style w:type="paragraph" w:styleId="BodyText2">
     <w:name w:val="Body Text 2"/>
@@ -1926,6 +3106,9 @@
     <w:pPr>
       <w:spacing w:after="120" w:line="480" w:lineRule="auto"/>
     </w:pPr>
+    <w:rPr>
+      <w:lang w:val="fr-FR" w:eastAsia="fr-FR" w:bidi="fr-FR"/>
+    </w:rPr>
   </w:style>
   <w:style w:type="character" w:customStyle="1" w:styleId="BodyText2Char">
     <w:name w:val="Body Text 2 Char"/>
@@ -1933,6 +3116,9 @@
     <w:link w:val="BodyText2"/>
     <w:uiPriority w:val="99"/>
     <w:rsid w:val="00AA1D8D"/>
+    <w:rPr>
+      <w:lang w:val="fr-FR" w:eastAsia="fr-FR" w:bidi="fr-FR"/>
+    </w:rPr>
   </w:style>
   <w:style w:type="paragraph" w:styleId="BodyText3">
     <w:name w:val="Body Text 3"/>
@@ -1947,6 +3133,7 @@
     <w:rPr>
       <w:sz w:val="16"/>
       <w:szCs w:val="16"/>
+      <w:lang w:val="fr-FR" w:eastAsia="fr-FR" w:bidi="fr-FR"/>
     </w:rPr>
   </w:style>
   <w:style w:type="character" w:customStyle="1" w:styleId="BodyText3Char">
@@ -1958,6 +3145,7 @@
     <w:rPr>
       <w:sz w:val="16"/>
       <w:szCs w:val="16"/>
+      <w:lang w:val="fr-FR" w:eastAsia="fr-FR" w:bidi="fr-FR"/>
     </w:rPr>
   </w:style>
   <w:style w:type="paragraph" w:styleId="List">
@@ -1970,6 +3158,9 @@
       <w:ind w:left="360" w:hanging="360"/>
       <w:contextualSpacing/>
     </w:pPr>
+    <w:rPr>
+      <w:lang w:val="fr-FR" w:eastAsia="fr-FR" w:bidi="fr-FR"/>
+    </w:rPr>
   </w:style>
   <w:style w:type="paragraph" w:styleId="List2">
     <w:name w:val="List 2"/>
@@ -1981,6 +3172,9 @@
       <w:ind w:left="720" w:hanging="360"/>
       <w:contextualSpacing/>
     </w:pPr>
+    <w:rPr>
+      <w:lang w:val="fr-FR" w:eastAsia="fr-FR" w:bidi="fr-FR"/>
+    </w:rPr>
   </w:style>
   <w:style w:type="paragraph" w:styleId="List3">
     <w:name w:val="List 3"/>
@@ -1992,6 +3186,9 @@
       <w:ind w:left="1080" w:hanging="360"/>
       <w:contextualSpacing/>
     </w:pPr>
+    <w:rPr>
+      <w:lang w:val="fr-FR" w:eastAsia="fr-FR" w:bidi="fr-FR"/>
+    </w:rPr>
   </w:style>
   <w:style w:type="paragraph" w:styleId="ListBullet">
     <w:name w:val="List Bullet"/>
@@ -2010,6 +3207,7 @@
     <w:rPr>
       <w:rFonts w:ascii="Arial" w:hAnsi="Arial"/>
       <w:sz w:val="21"/>
+      <w:lang w:val="fr-FR" w:eastAsia="fr-FR" w:bidi="fr-FR"/>
     </w:rPr>
   </w:style>
   <w:style w:type="paragraph" w:styleId="ListBullet2">
@@ -2024,6 +3222,9 @@
       </w:numPr>
       <w:contextualSpacing/>
     </w:pPr>
+    <w:rPr>
+      <w:lang w:val="fr-FR" w:eastAsia="fr-FR" w:bidi="fr-FR"/>
+    </w:rPr>
   </w:style>
   <w:style w:type="paragraph" w:styleId="ListBullet3">
     <w:name w:val="List Bullet 3"/>
@@ -2037,6 +3238,9 @@
       </w:numPr>
       <w:contextualSpacing/>
     </w:pPr>
+    <w:rPr>
+      <w:lang w:val="fr-FR" w:eastAsia="fr-FR" w:bidi="fr-FR"/>
+    </w:rPr>
   </w:style>
   <w:style w:type="paragraph" w:styleId="ListNumber">
     <w:name w:val="List Number"/>
@@ -2055,6 +3259,7 @@
     <w:rPr>
       <w:rFonts w:ascii="Arial" w:hAnsi="Arial"/>
       <w:sz w:val="21"/>
+      <w:lang w:val="fr-FR" w:eastAsia="fr-FR" w:bidi="fr-FR"/>
     </w:rPr>
   </w:style>
   <w:style w:type="paragraph" w:styleId="ListNumber2">
@@ -2069,6 +3274,9 @@
       </w:numPr>
       <w:contextualSpacing/>
     </w:pPr>
+    <w:rPr>
+      <w:lang w:val="fr-FR" w:eastAsia="fr-FR" w:bidi="fr-FR"/>
+    </w:rPr>
   </w:style>
   <w:style w:type="paragraph" w:styleId="ListNumber3">
     <w:name w:val="List Number 3"/>
@@ -2082,6 +3290,9 @@
       </w:numPr>
       <w:contextualSpacing/>
     </w:pPr>
+    <w:rPr>
+      <w:lang w:val="fr-FR" w:eastAsia="fr-FR" w:bidi="fr-FR"/>
+    </w:rPr>
   </w:style>
   <w:style w:type="paragraph" w:styleId="ListContinue">
     <w:name w:val="List Continue"/>
@@ -2094,6 +3305,9 @@
       <w:ind w:left="360"/>
       <w:contextualSpacing/>
     </w:pPr>
+    <w:rPr>
+      <w:lang w:val="fr-FR" w:eastAsia="fr-FR" w:bidi="fr-FR"/>
+    </w:rPr>
   </w:style>
   <w:style w:type="paragraph" w:styleId="ListContinue2">
     <w:name w:val="List Continue 2"/>
@@ -2106,6 +3320,9 @@
       <w:ind w:left="720"/>
       <w:contextualSpacing/>
     </w:pPr>
+    <w:rPr>
+      <w:lang w:val="fr-FR" w:eastAsia="fr-FR" w:bidi="fr-FR"/>
+    </w:rPr>
   </w:style>
   <w:style w:type="paragraph" w:styleId="ListContinue3">
     <w:name w:val="List Continue 3"/>
@@ -2118,6 +3335,9 @@
       <w:ind w:left="1080"/>
       <w:contextualSpacing/>
     </w:pPr>
+    <w:rPr>
+      <w:lang w:val="fr-FR" w:eastAsia="fr-FR" w:bidi="fr-FR"/>
+    </w:rPr>
   </w:style>
   <w:style w:type="paragraph" w:styleId="MacroText">
     <w:name w:val="macro"/>
@@ -2140,6 +3360,7 @@
       <w:rFonts w:ascii="Courier" w:hAnsi="Courier"/>
       <w:sz w:val="20"/>
       <w:szCs w:val="20"/>
+      <w:lang w:val="fr-FR" w:eastAsia="fr-FR" w:bidi="fr-FR"/>
     </w:rPr>
   </w:style>
   <w:style w:type="character" w:customStyle="1" w:styleId="MacroTextChar">
@@ -2152,6 +3373,7 @@
       <w:rFonts w:ascii="Courier" w:hAnsi="Courier"/>
       <w:sz w:val="20"/>
       <w:szCs w:val="20"/>
+      <w:lang w:val="fr-FR" w:eastAsia="fr-FR" w:bidi="fr-FR"/>
     </w:rPr>
   </w:style>
   <w:style w:type="paragraph" w:styleId="Quote">
@@ -2166,6 +3388,7 @@
       <w:i/>
       <w:iCs/>
       <w:color w:val="000000" w:themeColor="text1"/>
+      <w:lang w:val="fr-FR" w:eastAsia="fr-FR" w:bidi="fr-FR"/>
     </w:rPr>
   </w:style>
   <w:style w:type="character" w:customStyle="1" w:styleId="QuoteChar">
@@ -2178,6 +3401,7 @@
       <w:i/>
       <w:iCs/>
       <w:color w:val="000000" w:themeColor="text1"/>
+      <w:lang w:val="fr-FR" w:eastAsia="fr-FR" w:bidi="fr-FR"/>
     </w:rPr>
   </w:style>
   <w:style w:type="character" w:customStyle="1" w:styleId="Heading4Char">
@@ -2194,6 +3418,7 @@
       <w:i/>
       <w:iCs/>
       <w:color w:val="4F81BD" w:themeColor="accent1"/>
+      <w:lang w:val="fr-FR" w:eastAsia="fr-FR" w:bidi="fr-FR"/>
     </w:rPr>
   </w:style>
   <w:style w:type="character" w:customStyle="1" w:styleId="Heading5Char">
@@ -2206,6 +3431,7 @@
     <w:rPr>
       <w:rFonts w:asciiTheme="majorHAnsi" w:eastAsiaTheme="majorEastAsia" w:hAnsiTheme="majorHAnsi" w:cstheme="majorBidi"/>
       <w:color w:val="243F60" w:themeColor="accent1" w:themeShade="7F"/>
+      <w:lang w:val="fr-FR" w:eastAsia="fr-FR" w:bidi="fr-FR"/>
     </w:rPr>
   </w:style>
   <w:style w:type="character" w:customStyle="1" w:styleId="Heading6Char">
@@ -2220,6 +3446,7 @@
       <w:i/>
       <w:iCs/>
       <w:color w:val="243F60" w:themeColor="accent1" w:themeShade="7F"/>
+      <w:lang w:val="fr-FR" w:eastAsia="fr-FR" w:bidi="fr-FR"/>
     </w:rPr>
   </w:style>
   <w:style w:type="character" w:customStyle="1" w:styleId="Heading7Char">
@@ -2234,6 +3461,7 @@
       <w:i/>
       <w:iCs/>
       <w:color w:val="404040" w:themeColor="text1" w:themeTint="BF"/>
+      <w:lang w:val="fr-FR" w:eastAsia="fr-FR" w:bidi="fr-FR"/>
     </w:rPr>
   </w:style>
   <w:style w:type="character" w:customStyle="1" w:styleId="Heading8Char">
@@ -2248,6 +3476,7 @@
       <w:color w:val="4F81BD" w:themeColor="accent1"/>
       <w:sz w:val="20"/>
       <w:szCs w:val="20"/>
+      <w:lang w:val="fr-FR" w:eastAsia="fr-FR" w:bidi="fr-FR"/>
     </w:rPr>
   </w:style>
   <w:style w:type="character" w:customStyle="1" w:styleId="Heading9Char">
@@ -2264,6 +3493,7 @@
       <w:color w:val="404040" w:themeColor="text1" w:themeTint="BF"/>
       <w:sz w:val="20"/>
       <w:szCs w:val="20"/>
+      <w:lang w:val="fr-FR" w:eastAsia="fr-FR" w:bidi="fr-FR"/>
     </w:rPr>
   </w:style>
   <w:style w:type="paragraph" w:styleId="Caption">
@@ -2286,6 +3516,7 @@
       <w:color w:val="56605C"/>
       <w:sz w:val="17"/>
       <w:szCs w:val="18"/>
+      <w:lang w:val="fr-FR" w:eastAsia="fr-FR" w:bidi="fr-FR"/>
     </w:rPr>
   </w:style>
   <w:style w:type="character" w:styleId="Strong">
@@ -2297,6 +3528,7 @@
     <w:rPr>
       <w:b/>
       <w:bCs/>
+      <w:lang w:val="fr-FR" w:eastAsia="fr-FR" w:bidi="fr-FR"/>
     </w:rPr>
   </w:style>
   <w:style w:type="character" w:styleId="Emphasis">
@@ -2308,6 +3540,7 @@
     <w:rPr>
       <w:i/>
       <w:iCs/>
+      <w:lang w:val="fr-FR" w:eastAsia="fr-FR" w:bidi="fr-FR"/>
     </w:rPr>
   </w:style>
   <w:style w:type="paragraph" w:styleId="IntenseQuote">
@@ -2331,6 +3564,7 @@
       <w:i/>
       <w:iCs/>
       <w:color w:val="4F81BD" w:themeColor="accent1"/>
+      <w:lang w:val="fr-FR" w:eastAsia="fr-FR" w:bidi="fr-FR"/>
     </w:rPr>
   </w:style>
   <w:style w:type="character" w:customStyle="1" w:styleId="IntenseQuoteChar">
@@ -2345,6 +3579,7 @@
       <w:i/>
       <w:iCs/>
       <w:color w:val="4F81BD" w:themeColor="accent1"/>
+      <w:lang w:val="fr-FR" w:eastAsia="fr-FR" w:bidi="fr-FR"/>
     </w:rPr>
   </w:style>
   <w:style w:type="character" w:styleId="SubtleEmphasis">
@@ -2357,6 +3592,7 @@
       <w:i/>
       <w:iCs/>
       <w:color w:val="808080" w:themeColor="text1" w:themeTint="7F"/>
+      <w:lang w:val="fr-FR" w:eastAsia="fr-FR" w:bidi="fr-FR"/>
     </w:rPr>
   </w:style>
   <w:style w:type="character" w:styleId="IntenseEmphasis">
@@ -2371,6 +3607,7 @@
       <w:i/>
       <w:iCs/>
       <w:color w:val="4F81BD" w:themeColor="accent1"/>
+      <w:lang w:val="fr-FR" w:eastAsia="fr-FR" w:bidi="fr-FR"/>
     </w:rPr>
   </w:style>
   <w:style w:type="character" w:styleId="SubtleReference">
@@ -2383,6 +3620,7 @@
       <w:smallCaps/>
       <w:color w:val="C0504D" w:themeColor="accent2"/>
       <w:u w:val="single"/>
+      <w:lang w:val="fr-FR" w:eastAsia="fr-FR" w:bidi="fr-FR"/>
     </w:rPr>
   </w:style>
   <w:style w:type="character" w:styleId="IntenseReference">
@@ -2398,6 +3636,7 @@
       <w:color w:val="C0504D" w:themeColor="accent2"/>
       <w:spacing w:val="5"/>
       <w:u w:val="single"/>
+      <w:lang w:val="fr-FR" w:eastAsia="fr-FR" w:bidi="fr-FR"/>
     </w:rPr>
   </w:style>
   <w:style w:type="character" w:styleId="BookTitle">
@@ -2411,6 +3650,7 @@
       <w:bCs/>
       <w:smallCaps/>
       <w:spacing w:val="5"/>
+      <w:lang w:val="fr-FR" w:eastAsia="fr-FR" w:bidi="fr-FR"/>
     </w:rPr>
   </w:style>
   <w:style w:type="paragraph" w:styleId="TOCHeading">
@@ -2425,6 +3665,9 @@
     <w:pPr>
       <w:outlineLvl w:val="9"/>
     </w:pPr>
+    <w:rPr>
+      <w:lang w:val="fr-FR" w:eastAsia="fr-FR" w:bidi="fr-FR"/>
+    </w:rPr>
   </w:style>
   <w:style w:type="table" w:styleId="TableGrid">
     <w:name w:val="Table Grid"/>
@@ -2434,6 +3677,9 @@
     <w:pPr>
       <w:spacing w:after="0" w:line="240" w:lineRule="auto"/>
     </w:pPr>
+    <w:rPr>
+      <w:lang w:val="fr-FR" w:eastAsia="fr-FR" w:bidi="fr-FR"/>
+    </w:rPr>
     <w:tblPr>
       <w:tblInd w:w="0" w:type="dxa"/>
       <w:tblBorders>
@@ -2462,6 +3708,7 @@
     </w:pPr>
     <w:rPr>
       <w:color w:val="000000" w:themeColor="text1" w:themeShade="BF"/>
+      <w:lang w:val="fr-FR" w:eastAsia="fr-FR" w:bidi="fr-FR"/>
     </w:rPr>
     <w:tblPr>
       <w:tblStyleRowBandSize w:val="1"/>
@@ -2565,6 +3812,7 @@
     </w:pPr>
     <w:rPr>
       <w:color w:val="365F91" w:themeColor="accent1" w:themeShade="BF"/>
+      <w:lang w:val="fr-FR" w:eastAsia="fr-FR" w:bidi="fr-FR"/>
     </w:rPr>
     <w:tblPr>
       <w:tblStyleRowBandSize w:val="1"/>
@@ -2668,6 +3916,7 @@
     </w:pPr>
     <w:rPr>
       <w:color w:val="943634" w:themeColor="accent2" w:themeShade="BF"/>
+      <w:lang w:val="fr-FR" w:eastAsia="fr-FR" w:bidi="fr-FR"/>
     </w:rPr>
     <w:tblPr>
       <w:tblStyleRowBandSize w:val="1"/>
@@ -2771,6 +4020,7 @@
     </w:pPr>
     <w:rPr>
       <w:color w:val="76923C" w:themeColor="accent3" w:themeShade="BF"/>
+      <w:lang w:val="fr-FR" w:eastAsia="fr-FR" w:bidi="fr-FR"/>
     </w:rPr>
     <w:tblPr>
       <w:tblStyleRowBandSize w:val="1"/>
@@ -2874,6 +4124,7 @@
     </w:pPr>
     <w:rPr>
       <w:color w:val="5F497A" w:themeColor="accent4" w:themeShade="BF"/>
+      <w:lang w:val="fr-FR" w:eastAsia="fr-FR" w:bidi="fr-FR"/>
     </w:rPr>
     <w:tblPr>
       <w:tblStyleRowBandSize w:val="1"/>
@@ -2977,6 +4228,7 @@
     </w:pPr>
     <w:rPr>
       <w:color w:val="31849B" w:themeColor="accent5" w:themeShade="BF"/>
+      <w:lang w:val="fr-FR" w:eastAsia="fr-FR" w:bidi="fr-FR"/>
     </w:rPr>
     <w:tblPr>
       <w:tblStyleRowBandSize w:val="1"/>
@@ -3080,6 +4332,7 @@
     </w:pPr>
     <w:rPr>
       <w:color w:val="E36C0A" w:themeColor="accent6" w:themeShade="BF"/>
+      <w:lang w:val="fr-FR" w:eastAsia="fr-FR" w:bidi="fr-FR"/>
     </w:rPr>
     <w:tblPr>
       <w:tblStyleRowBandSize w:val="1"/>
@@ -3181,6 +4434,9 @@
     <w:pPr>
       <w:spacing w:after="0" w:line="240" w:lineRule="auto"/>
     </w:pPr>
+    <w:rPr>
+      <w:lang w:val="fr-FR" w:eastAsia="fr-FR" w:bidi="fr-FR"/>
+    </w:rPr>
     <w:tblPr>
       <w:tblStyleRowBandSize w:val="1"/>
       <w:tblStyleColBandSize w:val="1"/>
@@ -3273,6 +4529,9 @@
     <w:pPr>
       <w:spacing w:after="0" w:line="240" w:lineRule="auto"/>
     </w:pPr>
+    <w:rPr>
+      <w:lang w:val="fr-FR" w:eastAsia="fr-FR" w:bidi="fr-FR"/>
+    </w:rPr>
     <w:tblPr>
       <w:tblStyleRowBandSize w:val="1"/>
       <w:tblStyleColBandSize w:val="1"/>
@@ -3365,6 +4624,9 @@
     <w:pPr>
       <w:spacing w:after="0" w:line="240" w:lineRule="auto"/>
     </w:pPr>
+    <w:rPr>
+      <w:lang w:val="fr-FR" w:eastAsia="fr-FR" w:bidi="fr-FR"/>
+    </w:rPr>
     <w:tblPr>
       <w:tblStyleRowBandSize w:val="1"/>
       <w:tblStyleColBandSize w:val="1"/>
@@ -3457,6 +4719,9 @@
     <w:pPr>
       <w:spacing w:after="0" w:line="240" w:lineRule="auto"/>
     </w:pPr>
+    <w:rPr>
+      <w:lang w:val="fr-FR" w:eastAsia="fr-FR" w:bidi="fr-FR"/>
+    </w:rPr>
     <w:tblPr>
       <w:tblStyleRowBandSize w:val="1"/>
       <w:tblStyleColBandSize w:val="1"/>
@@ -3549,6 +4814,9 @@
     <w:pPr>
       <w:spacing w:after="0" w:line="240" w:lineRule="auto"/>
     </w:pPr>
+    <w:rPr>
+      <w:lang w:val="fr-FR" w:eastAsia="fr-FR" w:bidi="fr-FR"/>
+    </w:rPr>
     <w:tblPr>
       <w:tblStyleRowBandSize w:val="1"/>
       <w:tblStyleColBandSize w:val="1"/>
@@ -3641,6 +4909,9 @@
     <w:pPr>
       <w:spacing w:after="0" w:line="240" w:lineRule="auto"/>
     </w:pPr>
+    <w:rPr>
+      <w:lang w:val="fr-FR" w:eastAsia="fr-FR" w:bidi="fr-FR"/>
+    </w:rPr>
     <w:tblPr>
       <w:tblStyleRowBandSize w:val="1"/>
       <w:tblStyleColBandSize w:val="1"/>
@@ -3733,6 +5004,9 @@
     <w:pPr>
       <w:spacing w:after="0" w:line="240" w:lineRule="auto"/>
     </w:pPr>
+    <w:rPr>
+      <w:lang w:val="fr-FR" w:eastAsia="fr-FR" w:bidi="fr-FR"/>
+    </w:rPr>
     <w:tblPr>
       <w:tblStyleRowBandSize w:val="1"/>
       <w:tblStyleColBandSize w:val="1"/>
@@ -3825,6 +5099,9 @@
     <w:pPr>
       <w:spacing w:after="0" w:line="240" w:lineRule="auto"/>
     </w:pPr>
+    <w:rPr>
+      <w:lang w:val="fr-FR" w:eastAsia="fr-FR" w:bidi="fr-FR"/>
+    </w:rPr>
     <w:tblPr>
       <w:tblStyleRowBandSize w:val="1"/>
       <w:tblStyleColBandSize w:val="1"/>
@@ -3955,6 +5232,9 @@
     <w:pPr>
       <w:spacing w:after="0" w:line="240" w:lineRule="auto"/>
     </w:pPr>
+    <w:rPr>
+      <w:lang w:val="fr-FR" w:eastAsia="fr-FR" w:bidi="fr-FR"/>
+    </w:rPr>
     <w:tblPr>
       <w:tblStyleRowBandSize w:val="1"/>
       <w:tblStyleColBandSize w:val="1"/>
@@ -4085,6 +5365,9 @@
     <w:pPr>
       <w:spacing w:after="0" w:line="240" w:lineRule="auto"/>
     </w:pPr>
+    <w:rPr>
+      <w:lang w:val="fr-FR" w:eastAsia="fr-FR" w:bidi="fr-FR"/>
+    </w:rPr>
     <w:tblPr>
       <w:tblStyleRowBandSize w:val="1"/>
       <w:tblStyleColBandSize w:val="1"/>
@@ -4215,6 +5498,9 @@
     <w:pPr>
       <w:spacing w:after="0" w:line="240" w:lineRule="auto"/>
     </w:pPr>
+    <w:rPr>
+      <w:lang w:val="fr-FR" w:eastAsia="fr-FR" w:bidi="fr-FR"/>
+    </w:rPr>
     <w:tblPr>
       <w:tblStyleRowBandSize w:val="1"/>
       <w:tblStyleColBandSize w:val="1"/>
@@ -4345,6 +5631,9 @@
     <w:pPr>
       <w:spacing w:after="0" w:line="240" w:lineRule="auto"/>
     </w:pPr>
+    <w:rPr>
+      <w:lang w:val="fr-FR" w:eastAsia="fr-FR" w:bidi="fr-FR"/>
+    </w:rPr>
     <w:tblPr>
       <w:tblStyleRowBandSize w:val="1"/>
       <w:tblStyleColBandSize w:val="1"/>
@@ -4475,6 +5764,9 @@
     <w:pPr>
       <w:spacing w:after="0" w:line="240" w:lineRule="auto"/>
     </w:pPr>
+    <w:rPr>
+      <w:lang w:val="fr-FR" w:eastAsia="fr-FR" w:bidi="fr-FR"/>
+    </w:rPr>
     <w:tblPr>
       <w:tblStyleRowBandSize w:val="1"/>
       <w:tblStyleColBandSize w:val="1"/>
@@ -4605,6 +5897,9 @@
     <w:pPr>
       <w:spacing w:after="0" w:line="240" w:lineRule="auto"/>
     </w:pPr>
+    <w:rPr>
+      <w:lang w:val="fr-FR" w:eastAsia="fr-FR" w:bidi="fr-FR"/>
+    </w:rPr>
     <w:tblPr>
       <w:tblStyleRowBandSize w:val="1"/>
       <w:tblStyleColBandSize w:val="1"/>
@@ -4735,6 +6030,9 @@
     <w:pPr>
       <w:spacing w:after="0" w:line="240" w:lineRule="auto"/>
     </w:pPr>
+    <w:rPr>
+      <w:lang w:val="fr-FR" w:eastAsia="fr-FR" w:bidi="fr-FR"/>
+    </w:rPr>
     <w:tblPr>
       <w:tblStyleRowBandSize w:val="1"/>
       <w:tblStyleColBandSize w:val="1"/>
@@ -4841,6 +6139,9 @@
     <w:pPr>
       <w:spacing w:after="0" w:line="240" w:lineRule="auto"/>
     </w:pPr>
+    <w:rPr>
+      <w:lang w:val="fr-FR" w:eastAsia="fr-FR" w:bidi="fr-FR"/>
+    </w:rPr>
     <w:tblPr>
       <w:tblStyleRowBandSize w:val="1"/>
       <w:tblStyleColBandSize w:val="1"/>
@@ -4947,6 +6248,9 @@
     <w:pPr>
       <w:spacing w:after="0" w:line="240" w:lineRule="auto"/>
     </w:pPr>
+    <w:rPr>
+      <w:lang w:val="fr-FR" w:eastAsia="fr-FR" w:bidi="fr-FR"/>
+    </w:rPr>
     <w:tblPr>
       <w:tblStyleRowBandSize w:val="1"/>
       <w:tblStyleColBandSize w:val="1"/>
@@ -5053,6 +6357,9 @@
     <w:pPr>
       <w:spacing w:after="0" w:line="240" w:lineRule="auto"/>
     </w:pPr>
+    <w:rPr>
+      <w:lang w:val="fr-FR" w:eastAsia="fr-FR" w:bidi="fr-FR"/>
+    </w:rPr>
     <w:tblPr>
       <w:tblStyleRowBandSize w:val="1"/>
       <w:tblStyleColBandSize w:val="1"/>
@@ -5159,6 +6466,9 @@
     <w:pPr>
       <w:spacing w:after="0" w:line="240" w:lineRule="auto"/>
     </w:pPr>
+    <w:rPr>
+      <w:lang w:val="fr-FR" w:eastAsia="fr-FR" w:bidi="fr-FR"/>
+    </w:rPr>
     <w:tblPr>
       <w:tblStyleRowBandSize w:val="1"/>
       <w:tblStyleColBandSize w:val="1"/>
@@ -5265,6 +6575,9 @@
     <w:pPr>
       <w:spacing w:after="0" w:line="240" w:lineRule="auto"/>
     </w:pPr>
+    <w:rPr>
+      <w:lang w:val="fr-FR" w:eastAsia="fr-FR" w:bidi="fr-FR"/>
+    </w:rPr>
     <w:tblPr>
       <w:tblStyleRowBandSize w:val="1"/>
       <w:tblStyleColBandSize w:val="1"/>
@@ -5371,6 +6684,9 @@
     <w:pPr>
       <w:spacing w:after="0" w:line="240" w:lineRule="auto"/>
     </w:pPr>
+    <w:rPr>
+      <w:lang w:val="fr-FR" w:eastAsia="fr-FR" w:bidi="fr-FR"/>
+    </w:rPr>
     <w:tblPr>
       <w:tblStyleRowBandSize w:val="1"/>
       <w:tblStyleColBandSize w:val="1"/>
@@ -5477,6 +6793,9 @@
     <w:pPr>
       <w:spacing w:after="0" w:line="240" w:lineRule="auto"/>
     </w:pPr>
+    <w:rPr>
+      <w:lang w:val="fr-FR" w:eastAsia="fr-FR" w:bidi="fr-FR"/>
+    </w:rPr>
     <w:tblPr>
       <w:tblStyleRowBandSize w:val="1"/>
       <w:tblStyleColBandSize w:val="1"/>
@@ -5626,6 +6945,9 @@
     <w:pPr>
       <w:spacing w:after="0" w:line="240" w:lineRule="auto"/>
     </w:pPr>
+    <w:rPr>
+      <w:lang w:val="fr-FR" w:eastAsia="fr-FR" w:bidi="fr-FR"/>
+    </w:rPr>
     <w:tblPr>
       <w:tblStyleRowBandSize w:val="1"/>
       <w:tblStyleColBandSize w:val="1"/>
@@ -5775,6 +7097,9 @@
     <w:pPr>
       <w:spacing w:after="0" w:line="240" w:lineRule="auto"/>
     </w:pPr>
+    <w:rPr>
+      <w:lang w:val="fr-FR" w:eastAsia="fr-FR" w:bidi="fr-FR"/>
+    </w:rPr>
     <w:tblPr>
       <w:tblStyleRowBandSize w:val="1"/>
       <w:tblStyleColBandSize w:val="1"/>
@@ -5924,6 +7249,9 @@
     <w:pPr>
       <w:spacing w:after="0" w:line="240" w:lineRule="auto"/>
     </w:pPr>
+    <w:rPr>
+      <w:lang w:val="fr-FR" w:eastAsia="fr-FR" w:bidi="fr-FR"/>
+    </w:rPr>
     <w:tblPr>
       <w:tblStyleRowBandSize w:val="1"/>
       <w:tblStyleColBandSize w:val="1"/>
@@ -6073,6 +7401,9 @@
     <w:pPr>
       <w:spacing w:after="0" w:line="240" w:lineRule="auto"/>
     </w:pPr>
+    <w:rPr>
+      <w:lang w:val="fr-FR" w:eastAsia="fr-FR" w:bidi="fr-FR"/>
+    </w:rPr>
     <w:tblPr>
       <w:tblStyleRowBandSize w:val="1"/>
       <w:tblStyleColBandSize w:val="1"/>
@@ -6222,6 +7553,9 @@
     <w:pPr>
       <w:spacing w:after="0" w:line="240" w:lineRule="auto"/>
     </w:pPr>
+    <w:rPr>
+      <w:lang w:val="fr-FR" w:eastAsia="fr-FR" w:bidi="fr-FR"/>
+    </w:rPr>
     <w:tblPr>
       <w:tblStyleRowBandSize w:val="1"/>
       <w:tblStyleColBandSize w:val="1"/>
@@ -6371,6 +7705,9 @@
     <w:pPr>
       <w:spacing w:after="0" w:line="240" w:lineRule="auto"/>
     </w:pPr>
+    <w:rPr>
+      <w:lang w:val="fr-FR" w:eastAsia="fr-FR" w:bidi="fr-FR"/>
+    </w:rPr>
     <w:tblPr>
       <w:tblStyleRowBandSize w:val="1"/>
       <w:tblStyleColBandSize w:val="1"/>
@@ -6522,6 +7859,7 @@
     </w:pPr>
     <w:rPr>
       <w:color w:val="000000" w:themeColor="text1"/>
+      <w:lang w:val="fr-FR" w:eastAsia="fr-FR" w:bidi="fr-FR"/>
     </w:rPr>
     <w:tblPr>
       <w:tblStyleRowBandSize w:val="1"/>
@@ -6606,6 +7944,7 @@
     </w:pPr>
     <w:rPr>
       <w:color w:val="000000" w:themeColor="text1"/>
+      <w:lang w:val="fr-FR" w:eastAsia="fr-FR" w:bidi="fr-FR"/>
     </w:rPr>
     <w:tblPr>
       <w:tblStyleRowBandSize w:val="1"/>
@@ -6690,6 +8029,7 @@
     </w:pPr>
     <w:rPr>
       <w:color w:val="000000" w:themeColor="text1"/>
+      <w:lang w:val="fr-FR" w:eastAsia="fr-FR" w:bidi="fr-FR"/>
     </w:rPr>
     <w:tblPr>
       <w:tblStyleRowBandSize w:val="1"/>
@@ -6774,6 +8114,7 @@
     </w:pPr>
     <w:rPr>
       <w:color w:val="000000" w:themeColor="text1"/>
+      <w:lang w:val="fr-FR" w:eastAsia="fr-FR" w:bidi="fr-FR"/>
     </w:rPr>
     <w:tblPr>
       <w:tblStyleRowBandSize w:val="1"/>
@@ -6858,6 +8199,7 @@
     </w:pPr>
     <w:rPr>
       <w:color w:val="000000" w:themeColor="text1"/>
+      <w:lang w:val="fr-FR" w:eastAsia="fr-FR" w:bidi="fr-FR"/>
     </w:rPr>
     <w:tblPr>
       <w:tblStyleRowBandSize w:val="1"/>
@@ -6942,6 +8284,7 @@
     </w:pPr>
     <w:rPr>
       <w:color w:val="000000" w:themeColor="text1"/>
+      <w:lang w:val="fr-FR" w:eastAsia="fr-FR" w:bidi="fr-FR"/>
     </w:rPr>
     <w:tblPr>
       <w:tblStyleRowBandSize w:val="1"/>
@@ -7026,6 +8369,7 @@
     </w:pPr>
     <w:rPr>
       <w:color w:val="000000" w:themeColor="text1"/>
+      <w:lang w:val="fr-FR" w:eastAsia="fr-FR" w:bidi="fr-FR"/>
     </w:rPr>
     <w:tblPr>
       <w:tblStyleRowBandSize w:val="1"/>
@@ -7111,6 +8455,7 @@
     <w:rPr>
       <w:rFonts w:asciiTheme="majorHAnsi" w:eastAsiaTheme="majorEastAsia" w:hAnsiTheme="majorHAnsi" w:cstheme="majorBidi"/>
       <w:color w:val="000000" w:themeColor="text1"/>
+      <w:lang w:val="fr-FR" w:eastAsia="fr-FR" w:bidi="fr-FR"/>
     </w:rPr>
     <w:tblPr>
       <w:tblStyleRowBandSize w:val="1"/>
@@ -7239,6 +8584,7 @@
     <w:rPr>
       <w:rFonts w:asciiTheme="majorHAnsi" w:eastAsiaTheme="majorEastAsia" w:hAnsiTheme="majorHAnsi" w:cstheme="majorBidi"/>
       <w:color w:val="000000" w:themeColor="text1"/>
+      <w:lang w:val="fr-FR" w:eastAsia="fr-FR" w:bidi="fr-FR"/>
     </w:rPr>
     <w:tblPr>
       <w:tblStyleRowBandSize w:val="1"/>
@@ -7367,6 +8713,7 @@
     <w:rPr>
       <w:rFonts w:asciiTheme="majorHAnsi" w:eastAsiaTheme="majorEastAsia" w:hAnsiTheme="majorHAnsi" w:cstheme="majorBidi"/>
       <w:color w:val="000000" w:themeColor="text1"/>
+      <w:lang w:val="fr-FR" w:eastAsia="fr-FR" w:bidi="fr-FR"/>
     </w:rPr>
     <w:tblPr>
       <w:tblStyleRowBandSize w:val="1"/>
@@ -7495,6 +8842,7 @@
     <w:rPr>
       <w:rFonts w:asciiTheme="majorHAnsi" w:eastAsiaTheme="majorEastAsia" w:hAnsiTheme="majorHAnsi" w:cstheme="majorBidi"/>
       <w:color w:val="000000" w:themeColor="text1"/>
+      <w:lang w:val="fr-FR" w:eastAsia="fr-FR" w:bidi="fr-FR"/>
     </w:rPr>
     <w:tblPr>
       <w:tblStyleRowBandSize w:val="1"/>
@@ -7623,6 +8971,7 @@
     <w:rPr>
       <w:rFonts w:asciiTheme="majorHAnsi" w:eastAsiaTheme="majorEastAsia" w:hAnsiTheme="majorHAnsi" w:cstheme="majorBidi"/>
       <w:color w:val="000000" w:themeColor="text1"/>
+      <w:lang w:val="fr-FR" w:eastAsia="fr-FR" w:bidi="fr-FR"/>
     </w:rPr>
     <w:tblPr>
       <w:tblStyleRowBandSize w:val="1"/>
@@ -7751,6 +9100,7 @@
     <w:rPr>
       <w:rFonts w:asciiTheme="majorHAnsi" w:eastAsiaTheme="majorEastAsia" w:hAnsiTheme="majorHAnsi" w:cstheme="majorBidi"/>
       <w:color w:val="000000" w:themeColor="text1"/>
+      <w:lang w:val="fr-FR" w:eastAsia="fr-FR" w:bidi="fr-FR"/>
     </w:rPr>
     <w:tblPr>
       <w:tblStyleRowBandSize w:val="1"/>
@@ -7879,6 +9229,7 @@
     <w:rPr>
       <w:rFonts w:asciiTheme="majorHAnsi" w:eastAsiaTheme="majorEastAsia" w:hAnsiTheme="majorHAnsi" w:cstheme="majorBidi"/>
       <w:color w:val="000000" w:themeColor="text1"/>
+      <w:lang w:val="fr-FR" w:eastAsia="fr-FR" w:bidi="fr-FR"/>
     </w:rPr>
     <w:tblPr>
       <w:tblStyleRowBandSize w:val="1"/>
@@ -8004,6 +9355,9 @@
     <w:pPr>
       <w:spacing w:after="0" w:line="240" w:lineRule="auto"/>
     </w:pPr>
+    <w:rPr>
+      <w:lang w:val="fr-FR" w:eastAsia="fr-FR" w:bidi="fr-FR"/>
+    </w:rPr>
     <w:tblPr>
       <w:tblStyleRowBandSize w:val="1"/>
       <w:tblStyleColBandSize w:val="1"/>
@@ -8077,6 +9431,9 @@
     <w:pPr>
       <w:spacing w:after="0" w:line="240" w:lineRule="auto"/>
     </w:pPr>
+    <w:rPr>
+      <w:lang w:val="fr-FR" w:eastAsia="fr-FR" w:bidi="fr-FR"/>
+    </w:rPr>
     <w:tblPr>
       <w:tblStyleRowBandSize w:val="1"/>
       <w:tblStyleColBandSize w:val="1"/>
@@ -8150,6 +9507,9 @@
     <w:pPr>
       <w:spacing w:after="0" w:line="240" w:lineRule="auto"/>
     </w:pPr>
+    <w:rPr>
+      <w:lang w:val="fr-FR" w:eastAsia="fr-FR" w:bidi="fr-FR"/>
+    </w:rPr>
     <w:tblPr>
       <w:tblStyleRowBandSize w:val="1"/>
       <w:tblStyleColBandSize w:val="1"/>
@@ -8223,6 +9583,9 @@
     <w:pPr>
       <w:spacing w:after="0" w:line="240" w:lineRule="auto"/>
     </w:pPr>
+    <w:rPr>
+      <w:lang w:val="fr-FR" w:eastAsia="fr-FR" w:bidi="fr-FR"/>
+    </w:rPr>
     <w:tblPr>
       <w:tblStyleRowBandSize w:val="1"/>
       <w:tblStyleColBandSize w:val="1"/>
@@ -8296,6 +9659,9 @@
     <w:pPr>
       <w:spacing w:after="0" w:line="240" w:lineRule="auto"/>
     </w:pPr>
+    <w:rPr>
+      <w:lang w:val="fr-FR" w:eastAsia="fr-FR" w:bidi="fr-FR"/>
+    </w:rPr>
     <w:tblPr>
       <w:tblStyleRowBandSize w:val="1"/>
       <w:tblStyleColBandSize w:val="1"/>
@@ -8369,6 +9735,9 @@
     <w:pPr>
       <w:spacing w:after="0" w:line="240" w:lineRule="auto"/>
     </w:pPr>
+    <w:rPr>
+      <w:lang w:val="fr-FR" w:eastAsia="fr-FR" w:bidi="fr-FR"/>
+    </w:rPr>
     <w:tblPr>
       <w:tblStyleRowBandSize w:val="1"/>
       <w:tblStyleColBandSize w:val="1"/>
@@ -8442,6 +9811,9 @@
     <w:pPr>
       <w:spacing w:after="0" w:line="240" w:lineRule="auto"/>
     </w:pPr>
+    <w:rPr>
+      <w:lang w:val="fr-FR" w:eastAsia="fr-FR" w:bidi="fr-FR"/>
+    </w:rPr>
     <w:tblPr>
       <w:tblStyleRowBandSize w:val="1"/>
       <w:tblStyleColBandSize w:val="1"/>
@@ -8518,6 +9890,7 @@
     <w:rPr>
       <w:rFonts w:asciiTheme="majorHAnsi" w:eastAsiaTheme="majorEastAsia" w:hAnsiTheme="majorHAnsi" w:cstheme="majorBidi"/>
       <w:color w:val="000000" w:themeColor="text1"/>
+      <w:lang w:val="fr-FR" w:eastAsia="fr-FR" w:bidi="fr-FR"/>
     </w:rPr>
     <w:tblPr>
       <w:tblStyleRowBandSize w:val="1"/>
@@ -8643,6 +10016,7 @@
     <w:rPr>
       <w:rFonts w:asciiTheme="majorHAnsi" w:eastAsiaTheme="majorEastAsia" w:hAnsiTheme="majorHAnsi" w:cstheme="majorBidi"/>
       <w:color w:val="000000" w:themeColor="text1"/>
+      <w:lang w:val="fr-FR" w:eastAsia="fr-FR" w:bidi="fr-FR"/>
     </w:rPr>
     <w:tblPr>
       <w:tblStyleRowBandSize w:val="1"/>
@@ -8768,6 +10142,7 @@
     <w:rPr>
       <w:rFonts w:asciiTheme="majorHAnsi" w:eastAsiaTheme="majorEastAsia" w:hAnsiTheme="majorHAnsi" w:cstheme="majorBidi"/>
       <w:color w:val="000000" w:themeColor="text1"/>
+      <w:lang w:val="fr-FR" w:eastAsia="fr-FR" w:bidi="fr-FR"/>
     </w:rPr>
     <w:tblPr>
       <w:tblStyleRowBandSize w:val="1"/>
@@ -8893,6 +10268,7 @@
     <w:rPr>
       <w:rFonts w:asciiTheme="majorHAnsi" w:eastAsiaTheme="majorEastAsia" w:hAnsiTheme="majorHAnsi" w:cstheme="majorBidi"/>
       <w:color w:val="000000" w:themeColor="text1"/>
+      <w:lang w:val="fr-FR" w:eastAsia="fr-FR" w:bidi="fr-FR"/>
     </w:rPr>
     <w:tblPr>
       <w:tblStyleRowBandSize w:val="1"/>
@@ -9018,6 +10394,7 @@
     <w:rPr>
       <w:rFonts w:asciiTheme="majorHAnsi" w:eastAsiaTheme="majorEastAsia" w:hAnsiTheme="majorHAnsi" w:cstheme="majorBidi"/>
       <w:color w:val="000000" w:themeColor="text1"/>
+      <w:lang w:val="fr-FR" w:eastAsia="fr-FR" w:bidi="fr-FR"/>
     </w:rPr>
     <w:tblPr>
       <w:tblStyleRowBandSize w:val="1"/>
@@ -9143,6 +10520,7 @@
     <w:rPr>
       <w:rFonts w:asciiTheme="majorHAnsi" w:eastAsiaTheme="majorEastAsia" w:hAnsiTheme="majorHAnsi" w:cstheme="majorBidi"/>
       <w:color w:val="000000" w:themeColor="text1"/>
+      <w:lang w:val="fr-FR" w:eastAsia="fr-FR" w:bidi="fr-FR"/>
     </w:rPr>
     <w:tblPr>
       <w:tblStyleRowBandSize w:val="1"/>
@@ -9268,6 +10646,7 @@
     <w:rPr>
       <w:rFonts w:asciiTheme="majorHAnsi" w:eastAsiaTheme="majorEastAsia" w:hAnsiTheme="majorHAnsi" w:cstheme="majorBidi"/>
       <w:color w:val="000000" w:themeColor="text1"/>
+      <w:lang w:val="fr-FR" w:eastAsia="fr-FR" w:bidi="fr-FR"/>
     </w:rPr>
     <w:tblPr>
       <w:tblStyleRowBandSize w:val="1"/>
@@ -9390,6 +10769,9 @@
     <w:pPr>
       <w:spacing w:after="0" w:line="240" w:lineRule="auto"/>
     </w:pPr>
+    <w:rPr>
+      <w:lang w:val="fr-FR" w:eastAsia="fr-FR" w:bidi="fr-FR"/>
+    </w:rPr>
     <w:tblPr>
       <w:tblStyleRowBandSize w:val="1"/>
       <w:tblStyleColBandSize w:val="1"/>
@@ -9531,6 +10913,9 @@
     <w:pPr>
       <w:spacing w:after="0" w:line="240" w:lineRule="auto"/>
     </w:pPr>
+    <w:rPr>
+      <w:lang w:val="fr-FR" w:eastAsia="fr-FR" w:bidi="fr-FR"/>
+    </w:rPr>
     <w:tblPr>
       <w:tblStyleRowBandSize w:val="1"/>
       <w:tblStyleColBandSize w:val="1"/>
@@ -9672,6 +11057,9 @@
     <w:pPr>
       <w:spacing w:after="0" w:line="240" w:lineRule="auto"/>
     </w:pPr>
+    <w:rPr>
+      <w:lang w:val="fr-FR" w:eastAsia="fr-FR" w:bidi="fr-FR"/>
+    </w:rPr>
     <w:tblPr>
       <w:tblStyleRowBandSize w:val="1"/>
       <w:tblStyleColBandSize w:val="1"/>
@@ -9813,6 +11201,9 @@
     <w:pPr>
       <w:spacing w:after="0" w:line="240" w:lineRule="auto"/>
     </w:pPr>
+    <w:rPr>
+      <w:lang w:val="fr-FR" w:eastAsia="fr-FR" w:bidi="fr-FR"/>
+    </w:rPr>
     <w:tblPr>
       <w:tblStyleRowBandSize w:val="1"/>
       <w:tblStyleColBandSize w:val="1"/>
@@ -9954,6 +11345,9 @@
     <w:pPr>
       <w:spacing w:after="0" w:line="240" w:lineRule="auto"/>
     </w:pPr>
+    <w:rPr>
+      <w:lang w:val="fr-FR" w:eastAsia="fr-FR" w:bidi="fr-FR"/>
+    </w:rPr>
     <w:tblPr>
       <w:tblStyleRowBandSize w:val="1"/>
       <w:tblStyleColBandSize w:val="1"/>
@@ -10095,6 +11489,9 @@
     <w:pPr>
       <w:spacing w:after="0" w:line="240" w:lineRule="auto"/>
     </w:pPr>
+    <w:rPr>
+      <w:lang w:val="fr-FR" w:eastAsia="fr-FR" w:bidi="fr-FR"/>
+    </w:rPr>
     <w:tblPr>
       <w:tblStyleRowBandSize w:val="1"/>
       <w:tblStyleColBandSize w:val="1"/>
@@ -10236,6 +11633,9 @@
     <w:pPr>
       <w:spacing w:after="0" w:line="240" w:lineRule="auto"/>
     </w:pPr>
+    <w:rPr>
+      <w:lang w:val="fr-FR" w:eastAsia="fr-FR" w:bidi="fr-FR"/>
+    </w:rPr>
     <w:tblPr>
       <w:tblStyleRowBandSize w:val="1"/>
       <w:tblStyleColBandSize w:val="1"/>
@@ -10379,6 +11779,7 @@
     </w:pPr>
     <w:rPr>
       <w:color w:val="FFFFFF" w:themeColor="background1"/>
+      <w:lang w:val="fr-FR" w:eastAsia="fr-FR" w:bidi="fr-FR"/>
     </w:rPr>
     <w:tblPr>
       <w:tblStyleRowBandSize w:val="1"/>
@@ -10493,6 +11894,7 @@
     </w:pPr>
     <w:rPr>
       <w:color w:val="FFFFFF" w:themeColor="background1"/>
+      <w:lang w:val="fr-FR" w:eastAsia="fr-FR" w:bidi="fr-FR"/>
     </w:rPr>
     <w:tblPr>
       <w:tblStyleRowBandSize w:val="1"/>
@@ -10607,6 +12009,7 @@
     </w:pPr>
     <w:rPr>
       <w:color w:val="FFFFFF" w:themeColor="background1"/>
+      <w:lang w:val="fr-FR" w:eastAsia="fr-FR" w:bidi="fr-FR"/>
     </w:rPr>
     <w:tblPr>
       <w:tblStyleRowBandSize w:val="1"/>
@@ -10721,6 +12124,7 @@
     </w:pPr>
     <w:rPr>
       <w:color w:val="FFFFFF" w:themeColor="background1"/>
+      <w:lang w:val="fr-FR" w:eastAsia="fr-FR" w:bidi="fr-FR"/>
     </w:rPr>
     <w:tblPr>
       <w:tblStyleRowBandSize w:val="1"/>
@@ -10835,6 +12239,7 @@
     </w:pPr>
     <w:rPr>
       <w:color w:val="FFFFFF" w:themeColor="background1"/>
+      <w:lang w:val="fr-FR" w:eastAsia="fr-FR" w:bidi="fr-FR"/>
     </w:rPr>
     <w:tblPr>
       <w:tblStyleRowBandSize w:val="1"/>
@@ -10949,6 +12354,7 @@
     </w:pPr>
     <w:rPr>
       <w:color w:val="FFFFFF" w:themeColor="background1"/>
+      <w:lang w:val="fr-FR" w:eastAsia="fr-FR" w:bidi="fr-FR"/>
     </w:rPr>
     <w:tblPr>
       <w:tblStyleRowBandSize w:val="1"/>
@@ -11063,6 +12469,7 @@
     </w:pPr>
     <w:rPr>
       <w:color w:val="FFFFFF" w:themeColor="background1"/>
+      <w:lang w:val="fr-FR" w:eastAsia="fr-FR" w:bidi="fr-FR"/>
     </w:rPr>
     <w:tblPr>
       <w:tblStyleRowBandSize w:val="1"/>
@@ -11177,6 +12584,7 @@
     </w:pPr>
     <w:rPr>
       <w:color w:val="000000" w:themeColor="text1"/>
+      <w:lang w:val="fr-FR" w:eastAsia="fr-FR" w:bidi="fr-FR"/>
     </w:rPr>
     <w:tblPr>
       <w:tblStyleRowBandSize w:val="1"/>
@@ -11299,6 +12707,7 @@
     </w:pPr>
     <w:rPr>
       <w:color w:val="000000" w:themeColor="text1"/>
+      <w:lang w:val="fr-FR" w:eastAsia="fr-FR" w:bidi="fr-FR"/>
     </w:rPr>
     <w:tblPr>
       <w:tblStyleRowBandSize w:val="1"/>
@@ -11421,6 +12830,7 @@
     </w:pPr>
     <w:rPr>
       <w:color w:val="000000" w:themeColor="text1"/>
+      <w:lang w:val="fr-FR" w:eastAsia="fr-FR" w:bidi="fr-FR"/>
     </w:rPr>
     <w:tblPr>
       <w:tblStyleRowBandSize w:val="1"/>
@@ -11543,6 +12953,7 @@
     </w:pPr>
     <w:rPr>
       <w:color w:val="000000" w:themeColor="text1"/>
+      <w:lang w:val="fr-FR" w:eastAsia="fr-FR" w:bidi="fr-FR"/>
     </w:rPr>
     <w:tblPr>
       <w:tblStyleRowBandSize w:val="1"/>
@@ -11655,6 +13066,7 @@
     </w:pPr>
     <w:rPr>
       <w:color w:val="000000" w:themeColor="text1"/>
+      <w:lang w:val="fr-FR" w:eastAsia="fr-FR" w:bidi="fr-FR"/>
     </w:rPr>
     <w:tblPr>
       <w:tblStyleRowBandSize w:val="1"/>
@@ -11777,6 +13189,7 @@
     </w:pPr>
     <w:rPr>
       <w:color w:val="000000" w:themeColor="text1"/>
+      <w:lang w:val="fr-FR" w:eastAsia="fr-FR" w:bidi="fr-FR"/>
     </w:rPr>
     <w:tblPr>
       <w:tblStyleRowBandSize w:val="1"/>
@@ -11899,6 +13312,7 @@
     </w:pPr>
     <w:rPr>
       <w:color w:val="000000" w:themeColor="text1"/>
+      <w:lang w:val="fr-FR" w:eastAsia="fr-FR" w:bidi="fr-FR"/>
     </w:rPr>
     <w:tblPr>
       <w:tblStyleRowBandSize w:val="1"/>
@@ -12021,6 +13435,7 @@
     </w:pPr>
     <w:rPr>
       <w:color w:val="000000" w:themeColor="text1"/>
+      <w:lang w:val="fr-FR" w:eastAsia="fr-FR" w:bidi="fr-FR"/>
     </w:rPr>
     <w:tblPr>
       <w:tblStyleRowBandSize w:val="1"/>
@@ -12107,6 +13522,7 @@
     </w:pPr>
     <w:rPr>
       <w:color w:val="000000" w:themeColor="text1"/>
+      <w:lang w:val="fr-FR" w:eastAsia="fr-FR" w:bidi="fr-FR"/>
     </w:rPr>
     <w:tblPr>
       <w:tblStyleRowBandSize w:val="1"/>
@@ -12193,6 +13609,7 @@
     </w:pPr>
     <w:rPr>
       <w:color w:val="000000" w:themeColor="text1"/>
+      <w:lang w:val="fr-FR" w:eastAsia="fr-FR" w:bidi="fr-FR"/>
     </w:rPr>
     <w:tblPr>
       <w:tblStyleRowBandSize w:val="1"/>
@@ -12279,6 +13696,7 @@
     </w:pPr>
     <w:rPr>
       <w:color w:val="000000" w:themeColor="text1"/>
+      <w:lang w:val="fr-FR" w:eastAsia="fr-FR" w:bidi="fr-FR"/>
     </w:rPr>
     <w:tblPr>
       <w:tblStyleRowBandSize w:val="1"/>
@@ -12365,6 +13783,7 @@
     </w:pPr>
     <w:rPr>
       <w:color w:val="000000" w:themeColor="text1"/>
+      <w:lang w:val="fr-FR" w:eastAsia="fr-FR" w:bidi="fr-FR"/>
     </w:rPr>
     <w:tblPr>
       <w:tblStyleRowBandSize w:val="1"/>
@@ -12451,6 +13870,7 @@
     </w:pPr>
     <w:rPr>
       <w:color w:val="000000" w:themeColor="text1"/>
+      <w:lang w:val="fr-FR" w:eastAsia="fr-FR" w:bidi="fr-FR"/>
     </w:rPr>
     <w:tblPr>
       <w:tblStyleRowBandSize w:val="1"/>
@@ -12537,6 +13957,7 @@
     </w:pPr>
     <w:rPr>
       <w:color w:val="000000" w:themeColor="text1"/>
+      <w:lang w:val="fr-FR" w:eastAsia="fr-FR" w:bidi="fr-FR"/>
     </w:rPr>
     <w:tblPr>
       <w:tblStyleRowBandSize w:val="1"/>
@@ -12623,6 +14044,7 @@
     </w:pPr>
     <w:rPr>
       <w:color w:val="000000" w:themeColor="text1"/>
+      <w:lang w:val="fr-FR" w:eastAsia="fr-FR" w:bidi="fr-FR"/>
     </w:rPr>
     <w:tblPr>
       <w:tblStyleRowBandSize w:val="1"/>
@@ -12703,6 +14125,7 @@
     </w:pPr>
     <w:rPr>
       <w:color w:val="000000" w:themeColor="text1"/>
+      <w:lang w:val="fr-FR" w:eastAsia="fr-FR" w:bidi="fr-FR"/>
     </w:rPr>
     <w:tblPr>
       <w:tblStyleRowBandSize w:val="1"/>
@@ -12783,6 +14206,7 @@
     </w:pPr>
     <w:rPr>
       <w:color w:val="000000" w:themeColor="text1"/>
+      <w:lang w:val="fr-FR" w:eastAsia="fr-FR" w:bidi="fr-FR"/>
     </w:rPr>
     <w:tblPr>
       <w:tblStyleRowBandSize w:val="1"/>
@@ -12863,6 +14287,7 @@
     </w:pPr>
     <w:rPr>
       <w:color w:val="000000" w:themeColor="text1"/>
+      <w:lang w:val="fr-FR" w:eastAsia="fr-FR" w:bidi="fr-FR"/>
     </w:rPr>
     <w:tblPr>
       <w:tblStyleRowBandSize w:val="1"/>
@@ -12943,6 +14368,7 @@
     </w:pPr>
     <w:rPr>
       <w:color w:val="000000" w:themeColor="text1"/>
+      <w:lang w:val="fr-FR" w:eastAsia="fr-FR" w:bidi="fr-FR"/>
     </w:rPr>
     <w:tblPr>
       <w:tblStyleRowBandSize w:val="1"/>
@@ -13023,6 +14449,7 @@
     </w:pPr>
     <w:rPr>
       <w:color w:val="000000" w:themeColor="text1"/>
+      <w:lang w:val="fr-FR" w:eastAsia="fr-FR" w:bidi="fr-FR"/>
     </w:rPr>
     <w:tblPr>
       <w:tblStyleRowBandSize w:val="1"/>
@@ -13103,6 +14530,7 @@
     </w:pPr>
     <w:rPr>
       <w:color w:val="000000" w:themeColor="text1"/>
+      <w:lang w:val="fr-FR" w:eastAsia="fr-FR" w:bidi="fr-FR"/>
     </w:rPr>
     <w:tblPr>
       <w:tblStyleRowBandSize w:val="1"/>

</xml_diff>